<commit_message>
Fix workshop flows and update manual
</commit_message>
<xml_diff>
--- a/FunniFin_Manuale_Utente.docx
+++ b/FunniFin_Manuale_Utente.docx
@@ -82,16 +82,9 @@
         <w:jc w:val="center"/>
       </w:pPr>
       <w:r>
-        <w:rPr>
-          <w:rFonts w:ascii="Helvetica" w:hAnsi="Helvetica" w:eastAsia="Helvetica" w:cs="Helvetica"/>
-          <w:b w:val="0"/>
-          <w:i w:val="0"/>
-          <w:color w:val="747878"/>
-          <w:sz w:val="20"/>
-        </w:rPr>
         <w:t>Guida operativa per Cliente, FunniFin, Esperto e Brand</w:t>
         <w:br/>
-        <w:t>Versione 2.0 · 18 giugno 2026</w:t>
+        <w:t>Versione 2.1 · 19 giugno 2026</w:t>
       </w:r>
     </w:p>
     <w:p/>
@@ -173,6 +166,34 @@
         <w:t>Questo manuale descrive le funzionalità operative disponibili per ciascun ruolo e il flusso completo dalla richiesta cliente alla conferma evento.</w:t>
       </w:r>
     </w:p>
+    <w:p>
+      <w:pPr>
+        <w:pStyle w:val="Subtitle"/>
+      </w:pPr>
+      <w:r>
+        <w:rPr>
+          <w:b/>
+        </w:rPr>
+        <w:t xml:space="preserve">Aggiornamento 2.1 - 19 giugno 2026: </w:t>
+      </w:r>
+      <w:r>
+        <w:t>guida allineata ai flussi verificati in test locale: partenza Cliente senza interessi preselezionati, calendario Date dinamico su data corrente, centro notifiche con azioni cliccabili e distinzione tra test E2E locali e smoke Google live.</w:t>
+      </w:r>
+    </w:p>
+    <CT_P>
+      <w:pPr>
+        <w:pStyle w:val="Subtitle"/>
+      </w:pPr>
+      <w:r>
+        <w:rPr>
+          <w:b/>
+        </w:rPr>
+        <w:t xml:space="preserve">Aggiornamento 2.1 - 19 giugno 2026: </w:t>
+      </w:r>
+      <w:r>
+        <w:t>allineata la guida ai flussi verificati in test locale: partenza Cliente senza interessi preselezionati, calendario Date dinamico su data corrente, centro notifiche con azioni cliccabili e distinzione tra test E2E locali e smoke Google live.</w:t>
+      </w:r>
+    </CT_P>
     <w:p>
       <w:r>
         <w:rPr>
@@ -2266,6 +2287,22 @@
     <w:p>
       <w:pPr>
         <w:pStyle w:val="ListBullet"/>
+      </w:pPr>
+      <w:r>
+        <w:t>All’apertura della vista pubblica non ci sono interessi o temi preselezionati: il Cliente deve scegliere almeno un ambito/tema oppure usare “Tutto il catalogo”.</w:t>
+      </w:r>
+    </w:p>
+    <CT_P>
+      <w:pPr>
+        <w:pStyle w:val="ListBullet"/>
+      </w:pPr>
+      <w:r>
+        <w:t>All’apertura della vista pubblica non ci sono interessi o temi preselezionati: il Cliente deve scegliere almeno un ambito/tema oppure usare “Tutto il catalogo”.</w:t>
+      </w:r>
+    </CT_P>
+    <w:p>
+      <w:pPr>
+        <w:pStyle w:val="ListBullet"/>
         <w:spacing w:after="40"/>
       </w:pPr>
       <w:r>
@@ -2412,6 +2449,18 @@
         <w:t>Per inviare la richiesta è necessario scegliere una data e un orario per ogni workshop selezionato. Le date restano proposte: FunniFin le verifica in seguito con Calendar e può approvarle, rifiutarle o chiedere modifiche.</w:t>
       </w:r>
     </w:p>
+    <w:p>
+      <w:pPr/>
+      <w:r>
+        <w:t>Il comando “Adesso” seleziona la data corrente del browser e propone il primo orario disponibile; i comandi mese precedente/successivo permettono di spostarsi oltre il mese visualizzato.</w:t>
+      </w:r>
+    </w:p>
+    <CT_P>
+      <w:pPr/>
+      <w:r>
+        <w:t>Il comando “Adesso” seleziona la data corrente del browser e propone il primo orario disponibile; i comandi mese precedente/successivo permettono di spostarsi oltre il mese visualizzato.</w:t>
+      </w:r>
+    </CT_P>
     <w:tbl>
       <w:tblPr>
         <w:tblW w:type="auto" w:w="0"/>
@@ -5448,6 +5497,18 @@
         <w:t>L’app usa un backend Apps Script per parlare con Google Workspace. Quando l’endpoint è configurato, le azioni reali passano da Sheets, Drive, Calendar e MailApp. Quando non è configurato o la sessione non è valida, le sezioni mostrano errore o fallback locale dove previsto.</w:t>
       </w:r>
     </w:p>
+    <w:p>
+      <w:pPr/>
+      <w:r>
+        <w:t>Per i test operativi: npm run test:e2e esegue la suite locale deterministica con fallback; npm run test:e2e:live esegue lo smoke Google reale e richiede un deploy Apps Script aggiornato con le action di smoke e una sessione FunniFin valida.</w:t>
+      </w:r>
+    </w:p>
+    <CT_P>
+      <w:pPr/>
+      <w:r>
+        <w:t>Per i test operativi: npm run test:e2e esegue la suite locale deterministica con fallback; npm run test:e2e:live esegue lo smoke Google reale e richiede un deploy Apps Script aggiornato con le action di smoke e una sessione FunniFin valida.</w:t>
+      </w:r>
+    </CT_P>
     <w:tbl>
       <w:tblPr>
         <w:tblStyle w:val="TableGrid"/>
@@ -6944,6 +7005,7 @@
     </w:p>
     <w:sectPr>
       <w:footerReference w:type="default" r:id="rId9"/>
+      <w:headerReference w:type="default" r:id="rId21"/>
       <w:pgSz w:w="12240" w:h="15840"/>
       <w:pgMar w:top="893" w:right="1008" w:bottom="835" w:left="1008" w:header="720" w:footer="720" w:gutter="0"/>
       <w:cols w:space="720"/>
@@ -6961,16 +7023,20 @@
       <w:jc w:val="center"/>
     </w:pPr>
     <w:r>
-      <w:rPr>
-        <w:rFonts w:ascii="Helvetica" w:hAnsi="Helvetica" w:eastAsia="Helvetica" w:cs="Helvetica"/>
-        <w:i w:val="0"/>
-        <w:color w:val="747878"/>
-        <w:sz w:val="15"/>
-      </w:rPr>
-      <w:t>FunniFin Workshop Planner · Manuale Utente v2.0 · 18 giugno 2026</w:t>
+      <w:t>FunniFin Workshop Planner · Manuale Utente v2.1 · 19 giugno 2026</w:t>
     </w:r>
   </w:p>
 </w:ftr>
+</file>
+
+<file path=word/header1.xml><?xml version="1.0" encoding="utf-8"?>
+<w:hdr xmlns:m="http://schemas.openxmlformats.org/officeDocument/2006/math" xmlns:mc="http://schemas.openxmlformats.org/markup-compatibility/2006" xmlns:mo="http://schemas.microsoft.com/office/mac/office/2008/main" xmlns:mv="urn:schemas-microsoft-com:mac:vml" xmlns:o="urn:schemas-microsoft-com:office:office" xmlns:r="http://schemas.openxmlformats.org/officeDocument/2006/relationships" xmlns:v="urn:schemas-microsoft-com:vml" xmlns:w10="urn:schemas-microsoft-com:office:word" xmlns:w14="http://schemas.microsoft.com/office/word/2010/wordml" xmlns:w="http://schemas.openxmlformats.org/wordprocessingml/2006/main" xmlns:wne="http://schemas.microsoft.com/office/word/2006/wordml" xmlns:wp14="http://schemas.microsoft.com/office/word/2010/wordprocessingDrawing" xmlns:wp="http://schemas.openxmlformats.org/drawingml/2006/wordprocessingDrawing" xmlns:wpc="http://schemas.microsoft.com/office/word/2010/wordprocessingCanvas" xmlns:wpg="http://schemas.microsoft.com/office/word/2010/wordprocessingGroup" xmlns:wpi="http://schemas.microsoft.com/office/word/2010/wordprocessingInk" xmlns:wps="http://schemas.microsoft.com/office/word/2010/wordprocessingShape" mc:Ignorable="w14 wp14">
+  <w:p>
+    <w:pPr>
+      <w:pStyle w:val="Header"/>
+    </w:pPr>
+  </w:p>
+</w:hdr>
 </file>
 
 <file path=word/numbering.xml><?xml version="1.0" encoding="utf-8"?>

</xml_diff>

<commit_message>
Expand manual with annotated workflow atlas
</commit_message>
<xml_diff>
--- a/FunniFin_Manuale_Utente.docx
+++ b/FunniFin_Manuale_Utente.docx
@@ -84,7 +84,7 @@
       <w:r>
         <w:t>Guida operativa per Cliente, FunniFin, Esperto e Brand</w:t>
         <w:br/>
-        <w:t>Versione 2.1 · 19 giugno 2026</w:t>
+        <w:t>Versione 2.2 · 19 giugno 2026</w:t>
       </w:r>
     </w:p>
     <w:p/>
@@ -171,13 +171,7 @@
         <w:pStyle w:val="Subtitle"/>
       </w:pPr>
       <w:r>
-        <w:rPr>
-          <w:b/>
-        </w:rPr>
-        <w:t xml:space="preserve">Aggiornamento 2.1 - 19 giugno 2026: </w:t>
-      </w:r>
-      <w:r>
-        <w:t>guida allineata ai flussi verificati in test locale: partenza Cliente senza interessi preselezionati, calendario Date dinamico su data corrente, centro notifiche con azioni cliccabili e distinzione tra test E2E locali e smoke Google live.</w:t>
+        <w:t>Aggiornamento 2.2 - 19 giugno 2026: manuale esteso con atlante UI annotato, bottom action bar/fixed bottom sheet, centro notifiche, categorie/priorita/status, mail operative, destinatari per fase, fallback backend e copertura test/regressioni.</w:t>
       </w:r>
     </w:p>
     <CT_P>
@@ -2202,7 +2196,7 @@
         </w:rPr>
         <w:drawing>
           <wp:inline xmlns:a="http://schemas.openxmlformats.org/drawingml/2006/main" xmlns:pic="http://schemas.openxmlformats.org/drawingml/2006/picture">
-            <wp:extent cx="4310743" cy="6537960"/>
+            <wp:extent cx="4315968" cy="6549268"/>
             <wp:docPr id="2" name="Picture 2"/>
             <wp:cNvGraphicFramePr>
               <a:graphicFrameLocks noChangeAspect="1"/>
@@ -2223,7 +2217,7 @@
                   <pic:spPr>
                     <a:xfrm>
                       <a:off x="0" y="0"/>
-                      <a:ext cx="4310743" cy="6537960"/>
+                      <a:ext cx="4315968" cy="6549268"/>
                     </a:xfrm>
                     <a:prstGeom prst="rect"/>
                   </pic:spPr>
@@ -3380,7 +3374,7 @@
         </w:rPr>
         <w:drawing>
           <wp:inline xmlns:a="http://schemas.openxmlformats.org/drawingml/2006/main" xmlns:pic="http://schemas.openxmlformats.org/drawingml/2006/picture">
-            <wp:extent cx="5897880" cy="5639848"/>
+            <wp:extent cx="5897880" cy="4914900"/>
             <wp:docPr id="3" name="Picture 3"/>
             <wp:cNvGraphicFramePr>
               <a:graphicFrameLocks noChangeAspect="1"/>
@@ -3401,7 +3395,7 @@
                   <pic:spPr>
                     <a:xfrm>
                       <a:off x="0" y="0"/>
-                      <a:ext cx="5897880" cy="5639848"/>
+                      <a:ext cx="5897880" cy="4914900"/>
                     </a:xfrm>
                     <a:prstGeom prst="rect"/>
                   </pic:spPr>
@@ -3979,7 +3973,7 @@
         </w:rPr>
         <w:drawing>
           <wp:inline xmlns:a="http://schemas.openxmlformats.org/drawingml/2006/main" xmlns:pic="http://schemas.openxmlformats.org/drawingml/2006/picture">
-            <wp:extent cx="5557652" cy="6537960"/>
+            <wp:extent cx="4846320" cy="5701552"/>
             <wp:docPr id="5" name="Picture 5"/>
             <wp:cNvGraphicFramePr>
               <a:graphicFrameLocks noChangeAspect="1"/>
@@ -4000,7 +3994,7 @@
                   <pic:spPr>
                     <a:xfrm>
                       <a:off x="0" y="0"/>
-                      <a:ext cx="5557652" cy="6537960"/>
+                      <a:ext cx="4846320" cy="5701552"/>
                     </a:xfrm>
                     <a:prstGeom prst="rect"/>
                   </pic:spPr>
@@ -7003,6 +6997,4400 @@
         </w:rPr>
       </w:r>
     </w:p>
+    <w:p>
+      <w:r>
+        <w:br w:type="page"/>
+      </w:r>
+    </w:p>
+    <w:p>
+      <w:pPr>
+        <w:pStyle w:val="Heading1"/>
+      </w:pPr>
+      <w:r>
+        <w:t>11. Comportamenti comuni e bottom sheet fisso</w:t>
+      </w:r>
+    </w:p>
+    <w:p>
+      <w:r>
+        <w:t>Il bottom action bar e il fixed bottom sheet sono il comando operativo persistente dell’app. Restano ancorati al bordo inferiore nelle viste principali e riassumono lo stato corrente senza costringere l’utente a tornare in alto. La regola d’uso è sempre la stessa: a sinistra contesto e riepilogo, a destra azioni. Se un prerequisito manca, la CTA primaria resta disabilitata e sotto compare un hint testuale.</w:t>
+      </w:r>
+    </w:p>
+    <w:tbl>
+      <w:tblPr>
+        <w:tblStyle w:val="TableGrid"/>
+        <w:tblW w:type="auto" w:w="0"/>
+        <w:jc w:val="center"/>
+        <w:tblLook w:firstColumn="1" w:firstRow="1" w:lastColumn="0" w:lastRow="0" w:noHBand="0" w:noVBand="1" w:val="04A0"/>
+      </w:tblPr>
+      <w:tblGrid>
+        <w:gridCol w:w="5112"/>
+        <w:gridCol w:w="5112"/>
+      </w:tblGrid>
+      <w:tr>
+        <w:tc>
+          <w:tcPr>
+            <w:tcW w:type="dxa" w:w="5112"/>
+            <w:vAlign w:val="top"/>
+            <w:shd w:fill="D9F1F2"/>
+          </w:tcPr>
+          <w:p>
+            <w:r>
+              <w:rPr>
+                <w:sz w:val="17"/>
+              </w:rPr>
+            </w:r>
+            <w:r>
+              <w:rPr>
+                <w:b/>
+                <w:sz w:val="17"/>
+              </w:rPr>
+              <w:t>Elemento</w:t>
+            </w:r>
+          </w:p>
+        </w:tc>
+        <w:tc>
+          <w:tcPr>
+            <w:tcW w:type="dxa" w:w="5112"/>
+            <w:vAlign w:val="top"/>
+            <w:shd w:fill="D9F1F2"/>
+          </w:tcPr>
+          <w:p>
+            <w:r>
+              <w:rPr>
+                <w:sz w:val="17"/>
+              </w:rPr>
+            </w:r>
+            <w:r>
+              <w:rPr>
+                <w:b/>
+                <w:sz w:val="17"/>
+              </w:rPr>
+              <w:t>Comportamento da verificare</w:t>
+            </w:r>
+          </w:p>
+        </w:tc>
+      </w:tr>
+      <w:tr>
+        <w:tc>
+          <w:tcPr>
+            <w:tcW w:type="dxa" w:w="5112"/>
+            <w:vAlign w:val="top"/>
+          </w:tcPr>
+          <w:p>
+            <w:r>
+              <w:rPr>
+                <w:sz w:val="17"/>
+              </w:rPr>
+            </w:r>
+            <w:r>
+              <w:rPr>
+                <w:b w:val="0"/>
+                <w:sz w:val="17"/>
+              </w:rPr>
+              <w:t>Contesto</w:t>
+            </w:r>
+          </w:p>
+        </w:tc>
+        <w:tc>
+          <w:tcPr>
+            <w:tcW w:type="dxa" w:w="5112"/>
+            <w:vAlign w:val="top"/>
+          </w:tcPr>
+          <w:p>
+            <w:r>
+              <w:rPr>
+                <w:sz w:val="17"/>
+              </w:rPr>
+            </w:r>
+            <w:r>
+              <w:rPr>
+                <w:b w:val="0"/>
+                <w:sz w:val="17"/>
+              </w:rPr>
+              <w:t>Mostra step o area attiva: per Cliente indica Interessi/Workshop/Date; per ruoli riservati indica progetto o sezione operativa.</w:t>
+            </w:r>
+          </w:p>
+        </w:tc>
+      </w:tr>
+      <w:tr>
+        <w:tc>
+          <w:tcPr>
+            <w:tcW w:type="dxa" w:w="5112"/>
+            <w:vAlign w:val="top"/>
+          </w:tcPr>
+          <w:p>
+            <w:r>
+              <w:rPr>
+                <w:sz w:val="17"/>
+              </w:rPr>
+            </w:r>
+            <w:r>
+              <w:rPr>
+                <w:b w:val="0"/>
+                <w:sz w:val="17"/>
+              </w:rPr>
+              <w:t>Dettaglio</w:t>
+            </w:r>
+          </w:p>
+        </w:tc>
+        <w:tc>
+          <w:tcPr>
+            <w:tcW w:type="dxa" w:w="5112"/>
+            <w:vAlign w:val="top"/>
+          </w:tcPr>
+          <w:p>
+            <w:r>
+              <w:rPr>
+                <w:sz w:val="17"/>
+              </w:rPr>
+            </w:r>
+            <w:r>
+              <w:rPr>
+                <w:b w:val="0"/>
+                <w:sz w:val="17"/>
+              </w:rPr>
+              <w:t>Mostra conteggi, totale, progetto o stato utile alla prossima azione.</w:t>
+            </w:r>
+          </w:p>
+        </w:tc>
+      </w:tr>
+      <w:tr>
+        <w:tc>
+          <w:tcPr>
+            <w:tcW w:type="dxa" w:w="5112"/>
+            <w:vAlign w:val="top"/>
+          </w:tcPr>
+          <w:p>
+            <w:r>
+              <w:rPr>
+                <w:sz w:val="17"/>
+              </w:rPr>
+            </w:r>
+            <w:r>
+              <w:rPr>
+                <w:b w:val="0"/>
+                <w:sz w:val="17"/>
+              </w:rPr>
+              <w:t>Prezzo</w:t>
+            </w:r>
+          </w:p>
+        </w:tc>
+        <w:tc>
+          <w:tcPr>
+            <w:tcW w:type="dxa" w:w="5112"/>
+            <w:vAlign w:val="top"/>
+          </w:tcPr>
+          <w:p>
+            <w:r>
+              <w:rPr>
+                <w:sz w:val="17"/>
+              </w:rPr>
+            </w:r>
+            <w:r>
+              <w:rPr>
+                <w:b w:val="0"/>
+                <w:sz w:val="17"/>
+              </w:rPr>
+              <w:t>Quando presente mostra prezzo precedente, prezzo finale e label sconto; non appare in viste dove non serve.</w:t>
+            </w:r>
+          </w:p>
+        </w:tc>
+      </w:tr>
+      <w:tr>
+        <w:tc>
+          <w:tcPr>
+            <w:tcW w:type="dxa" w:w="5112"/>
+            <w:vAlign w:val="top"/>
+          </w:tcPr>
+          <w:p>
+            <w:r>
+              <w:rPr>
+                <w:sz w:val="17"/>
+              </w:rPr>
+            </w:r>
+            <w:r>
+              <w:rPr>
+                <w:b w:val="0"/>
+                <w:sz w:val="17"/>
+              </w:rPr>
+              <w:t>Back</w:t>
+            </w:r>
+          </w:p>
+        </w:tc>
+        <w:tc>
+          <w:tcPr>
+            <w:tcW w:type="dxa" w:w="5112"/>
+            <w:vAlign w:val="top"/>
+          </w:tcPr>
+          <w:p>
+            <w:r>
+              <w:rPr>
+                <w:sz w:val="17"/>
+              </w:rPr>
+            </w:r>
+            <w:r>
+              <w:rPr>
+                <w:b w:val="0"/>
+                <w:sz w:val="17"/>
+              </w:rPr>
+              <w:t>Icona freccia con aria-label; compare solo quando esiste un’azione di ritorno sensata.</w:t>
+            </w:r>
+          </w:p>
+        </w:tc>
+      </w:tr>
+      <w:tr>
+        <w:tc>
+          <w:tcPr>
+            <w:tcW w:type="dxa" w:w="5112"/>
+            <w:vAlign w:val="top"/>
+          </w:tcPr>
+          <w:p>
+            <w:r>
+              <w:rPr>
+                <w:sz w:val="17"/>
+              </w:rPr>
+            </w:r>
+            <w:r>
+              <w:rPr>
+                <w:b w:val="0"/>
+                <w:sz w:val="17"/>
+              </w:rPr>
+              <w:t>Secondaria</w:t>
+            </w:r>
+          </w:p>
+        </w:tc>
+        <w:tc>
+          <w:tcPr>
+            <w:tcW w:type="dxa" w:w="5112"/>
+            <w:vAlign w:val="top"/>
+          </w:tcPr>
+          <w:p>
+            <w:r>
+              <w:rPr>
+                <w:sz w:val="17"/>
+              </w:rPr>
+            </w:r>
+            <w:r>
+              <w:rPr>
+                <w:b w:val="0"/>
+                <w:sz w:val="17"/>
+              </w:rPr>
+              <w:t>Azione ghost contestuale: esplora, modifica, aggiorna o annulla a seconda dello step.</w:t>
+            </w:r>
+          </w:p>
+        </w:tc>
+      </w:tr>
+      <w:tr>
+        <w:tc>
+          <w:tcPr>
+            <w:tcW w:type="dxa" w:w="5112"/>
+            <w:vAlign w:val="top"/>
+          </w:tcPr>
+          <w:p>
+            <w:r>
+              <w:rPr>
+                <w:sz w:val="17"/>
+              </w:rPr>
+            </w:r>
+            <w:r>
+              <w:rPr>
+                <w:b w:val="0"/>
+                <w:sz w:val="17"/>
+              </w:rPr>
+              <w:t>Primaria</w:t>
+            </w:r>
+          </w:p>
+        </w:tc>
+        <w:tc>
+          <w:tcPr>
+            <w:tcW w:type="dxa" w:w="5112"/>
+            <w:vAlign w:val="top"/>
+          </w:tcPr>
+          <w:p>
+            <w:r>
+              <w:rPr>
+                <w:sz w:val="17"/>
+              </w:rPr>
+            </w:r>
+            <w:r>
+              <w:rPr>
+                <w:b w:val="0"/>
+                <w:sz w:val="17"/>
+              </w:rPr>
+              <w:t>Azione principale; se disabilitata deve spiegare cosa manca con primaryHint.</w:t>
+            </w:r>
+          </w:p>
+        </w:tc>
+      </w:tr>
+      <w:tr>
+        <w:tc>
+          <w:tcPr>
+            <w:tcW w:type="dxa" w:w="5112"/>
+            <w:vAlign w:val="top"/>
+          </w:tcPr>
+          <w:p>
+            <w:r>
+              <w:rPr>
+                <w:sz w:val="17"/>
+              </w:rPr>
+            </w:r>
+            <w:r>
+              <w:rPr>
+                <w:b w:val="0"/>
+                <w:sz w:val="17"/>
+              </w:rPr>
+              <w:t>Mobile/desktop</w:t>
+            </w:r>
+          </w:p>
+        </w:tc>
+        <w:tc>
+          <w:tcPr>
+            <w:tcW w:type="dxa" w:w="5112"/>
+            <w:vAlign w:val="top"/>
+          </w:tcPr>
+          <w:p>
+            <w:r>
+              <w:rPr>
+                <w:sz w:val="17"/>
+              </w:rPr>
+            </w:r>
+            <w:r>
+              <w:rPr>
+                <w:b w:val="0"/>
+                <w:sz w:val="17"/>
+              </w:rPr>
+              <w:t>Il contenuto deve restare leggibile e non sovrapporsi; il footer non deve coprire modali o pannelli critici.</w:t>
+            </w:r>
+          </w:p>
+        </w:tc>
+      </w:tr>
+    </w:tbl>
+    <w:p>
+      <w:r>
+        <w:rPr>
+          <w:b/>
+        </w:rPr>
+        <w:t xml:space="preserve">Minuzia operativa: </w:t>
+      </w:r>
+      <w:r>
+        <w:t>Il bottone principale non deve essere usato come unica fonte informativa: quando è disabilitato, l’hint sotto il bottone deve spiegare quale dato manca, ad esempio interesse, workshop, data o contatto.</w:t>
+      </w:r>
+    </w:p>
+    <w:p>
+      <w:pPr>
+        <w:pStyle w:val="Heading1"/>
+      </w:pPr>
+      <w:r>
+        <w:t>12. Toast, notifiche e centro notifiche</w:t>
+      </w:r>
+    </w:p>
+    <w:p>
+      <w:r>
+        <w:t>L’app distingue i toast locali dalle notifiche persistenti. I toast sono feedback rapidi e spariscono automaticamente. Le notifiche persistenti entrano nel centro notifiche solo quando notify() riceve una audience esplicita. Il Cliente non ha centro notifiche: la campanella appare solo per FunniFin, Esperto e Brand.</w:t>
+      </w:r>
+    </w:p>
+    <w:tbl>
+      <w:tblPr>
+        <w:tblStyle w:val="TableGrid"/>
+        <w:tblW w:type="auto" w:w="0"/>
+        <w:jc w:val="center"/>
+        <w:tblLook w:firstColumn="1" w:firstRow="1" w:lastColumn="0" w:lastRow="0" w:noHBand="0" w:noVBand="1" w:val="04A0"/>
+      </w:tblPr>
+      <w:tblGrid>
+        <w:gridCol w:w="3408"/>
+        <w:gridCol w:w="3408"/>
+        <w:gridCol w:w="3408"/>
+      </w:tblGrid>
+      <w:tr>
+        <w:tc>
+          <w:tcPr>
+            <w:tcW w:type="dxa" w:w="3408"/>
+            <w:vAlign w:val="top"/>
+            <w:shd w:fill="D9F1F2"/>
+          </w:tcPr>
+          <w:p>
+            <w:r>
+              <w:rPr>
+                <w:sz w:val="17"/>
+              </w:rPr>
+            </w:r>
+            <w:r>
+              <w:rPr>
+                <w:b/>
+                <w:sz w:val="17"/>
+              </w:rPr>
+              <w:t>Tipo</w:t>
+            </w:r>
+          </w:p>
+        </w:tc>
+        <w:tc>
+          <w:tcPr>
+            <w:tcW w:type="dxa" w:w="3408"/>
+            <w:vAlign w:val="top"/>
+            <w:shd w:fill="D9F1F2"/>
+          </w:tcPr>
+          <w:p>
+            <w:r>
+              <w:rPr>
+                <w:sz w:val="17"/>
+              </w:rPr>
+            </w:r>
+            <w:r>
+              <w:rPr>
+                <w:b/>
+                <w:sz w:val="17"/>
+              </w:rPr>
+              <w:t>Dove appare</w:t>
+            </w:r>
+          </w:p>
+        </w:tc>
+        <w:tc>
+          <w:tcPr>
+            <w:tcW w:type="dxa" w:w="3408"/>
+            <w:vAlign w:val="top"/>
+            <w:shd w:fill="D9F1F2"/>
+          </w:tcPr>
+          <w:p>
+            <w:r>
+              <w:rPr>
+                <w:sz w:val="17"/>
+              </w:rPr>
+            </w:r>
+            <w:r>
+              <w:rPr>
+                <w:b/>
+                <w:sz w:val="17"/>
+              </w:rPr>
+              <w:t>Quando si usa</w:t>
+            </w:r>
+          </w:p>
+        </w:tc>
+      </w:tr>
+      <w:tr>
+        <w:tc>
+          <w:tcPr>
+            <w:tcW w:type="dxa" w:w="3408"/>
+            <w:vAlign w:val="top"/>
+          </w:tcPr>
+          <w:p>
+            <w:r>
+              <w:rPr>
+                <w:sz w:val="17"/>
+              </w:rPr>
+            </w:r>
+            <w:r>
+              <w:rPr>
+                <w:b w:val="0"/>
+                <w:sz w:val="17"/>
+              </w:rPr>
+              <w:t>Toast locale</w:t>
+            </w:r>
+          </w:p>
+        </w:tc>
+        <w:tc>
+          <w:tcPr>
+            <w:tcW w:type="dxa" w:w="3408"/>
+            <w:vAlign w:val="top"/>
+          </w:tcPr>
+          <w:p>
+            <w:r>
+              <w:rPr>
+                <w:sz w:val="17"/>
+              </w:rPr>
+            </w:r>
+            <w:r>
+              <w:rPr>
+                <w:b w:val="0"/>
+                <w:sz w:val="17"/>
+              </w:rPr>
+              <w:t>Angolo UI/toast stack temporaneo</w:t>
+            </w:r>
+          </w:p>
+        </w:tc>
+        <w:tc>
+          <w:tcPr>
+            <w:tcW w:type="dxa" w:w="3408"/>
+            <w:vAlign w:val="top"/>
+          </w:tcPr>
+          <w:p>
+            <w:r>
+              <w:rPr>
+                <w:sz w:val="17"/>
+              </w:rPr>
+            </w:r>
+            <w:r>
+              <w:rPr>
+                <w:b w:val="0"/>
+                <w:sz w:val="17"/>
+              </w:rPr>
+              <w:t>Feedback immediato: interesse aggiunto, date scelte, errore caricamento, sezione aggiornata.</w:t>
+            </w:r>
+          </w:p>
+        </w:tc>
+      </w:tr>
+      <w:tr>
+        <w:tc>
+          <w:tcPr>
+            <w:tcW w:type="dxa" w:w="3408"/>
+            <w:vAlign w:val="top"/>
+          </w:tcPr>
+          <w:p>
+            <w:r>
+              <w:rPr>
+                <w:sz w:val="17"/>
+              </w:rPr>
+            </w:r>
+            <w:r>
+              <w:rPr>
+                <w:b w:val="0"/>
+                <w:sz w:val="17"/>
+              </w:rPr>
+              <w:t>Notifica task</w:t>
+            </w:r>
+          </w:p>
+        </w:tc>
+        <w:tc>
+          <w:tcPr>
+            <w:tcW w:type="dxa" w:w="3408"/>
+            <w:vAlign w:val="top"/>
+          </w:tcPr>
+          <w:p>
+            <w:r>
+              <w:rPr>
+                <w:sz w:val="17"/>
+              </w:rPr>
+            </w:r>
+            <w:r>
+              <w:rPr>
+                <w:b w:val="0"/>
+                <w:sz w:val="17"/>
+              </w:rPr>
+              <w:t>Centro notifiche, tab Da fare</w:t>
+            </w:r>
+          </w:p>
+        </w:tc>
+        <w:tc>
+          <w:tcPr>
+            <w:tcW w:type="dxa" w:w="3408"/>
+            <w:vAlign w:val="top"/>
+          </w:tcPr>
+          <w:p>
+            <w:r>
+              <w:rPr>
+                <w:sz w:val="17"/>
+              </w:rPr>
+            </w:r>
+            <w:r>
+              <w:rPr>
+                <w:b w:val="0"/>
+                <w:sz w:val="17"/>
+              </w:rPr>
+              <w:t>Azione da completare: candidatura, revisione, approvazione, apertura progetto.</w:t>
+            </w:r>
+          </w:p>
+        </w:tc>
+      </w:tr>
+      <w:tr>
+        <w:tc>
+          <w:tcPr>
+            <w:tcW w:type="dxa" w:w="3408"/>
+            <w:vAlign w:val="top"/>
+          </w:tcPr>
+          <w:p>
+            <w:r>
+              <w:rPr>
+                <w:sz w:val="17"/>
+              </w:rPr>
+            </w:r>
+            <w:r>
+              <w:rPr>
+                <w:b w:val="0"/>
+                <w:sz w:val="17"/>
+              </w:rPr>
+              <w:t>Notifica mail</w:t>
+            </w:r>
+          </w:p>
+        </w:tc>
+        <w:tc>
+          <w:tcPr>
+            <w:tcW w:type="dxa" w:w="3408"/>
+            <w:vAlign w:val="top"/>
+          </w:tcPr>
+          <w:p>
+            <w:r>
+              <w:rPr>
+                <w:sz w:val="17"/>
+              </w:rPr>
+            </w:r>
+            <w:r>
+              <w:rPr>
+                <w:b w:val="0"/>
+                <w:sz w:val="17"/>
+              </w:rPr>
+              <w:t>Centro notifiche e filtri Mail</w:t>
+            </w:r>
+          </w:p>
+        </w:tc>
+        <w:tc>
+          <w:tcPr>
+            <w:tcW w:type="dxa" w:w="3408"/>
+            <w:vAlign w:val="top"/>
+          </w:tcPr>
+          <w:p>
+            <w:r>
+              <w:rPr>
+                <w:sz w:val="17"/>
+              </w:rPr>
+            </w:r>
+            <w:r>
+              <w:rPr>
+                <w:b w:val="0"/>
+                <w:sz w:val="17"/>
+              </w:rPr>
+              <w:t>Invio email riuscito, pronto in demo, fallback opaque o errore di consegna.</w:t>
+            </w:r>
+          </w:p>
+        </w:tc>
+      </w:tr>
+      <w:tr>
+        <w:tc>
+          <w:tcPr>
+            <w:tcW w:type="dxa" w:w="3408"/>
+            <w:vAlign w:val="top"/>
+          </w:tcPr>
+          <w:p>
+            <w:r>
+              <w:rPr>
+                <w:sz w:val="17"/>
+              </w:rPr>
+            </w:r>
+            <w:r>
+              <w:rPr>
+                <w:b w:val="0"/>
+                <w:sz w:val="17"/>
+              </w:rPr>
+              <w:t>Notifica system</w:t>
+            </w:r>
+          </w:p>
+        </w:tc>
+        <w:tc>
+          <w:tcPr>
+            <w:tcW w:type="dxa" w:w="3408"/>
+            <w:vAlign w:val="top"/>
+          </w:tcPr>
+          <w:p>
+            <w:r>
+              <w:rPr>
+                <w:sz w:val="17"/>
+              </w:rPr>
+            </w:r>
+            <w:r>
+              <w:rPr>
+                <w:b w:val="0"/>
+                <w:sz w:val="17"/>
+              </w:rPr>
+              <w:t>Centro notifiche e filtri Sistema</w:t>
+            </w:r>
+          </w:p>
+        </w:tc>
+        <w:tc>
+          <w:tcPr>
+            <w:tcW w:type="dxa" w:w="3408"/>
+            <w:vAlign w:val="top"/>
+          </w:tcPr>
+          <w:p>
+            <w:r>
+              <w:rPr>
+                <w:sz w:val="17"/>
+              </w:rPr>
+            </w:r>
+            <w:r>
+              <w:rPr>
+                <w:b w:val="0"/>
+                <w:sz w:val="17"/>
+              </w:rPr>
+              <w:t>Stato backend, sync Drive/Sheets/Calendar, health check.</w:t>
+            </w:r>
+          </w:p>
+        </w:tc>
+      </w:tr>
+      <w:tr>
+        <w:tc>
+          <w:tcPr>
+            <w:tcW w:type="dxa" w:w="3408"/>
+            <w:vAlign w:val="top"/>
+          </w:tcPr>
+          <w:p>
+            <w:r>
+              <w:rPr>
+                <w:sz w:val="17"/>
+              </w:rPr>
+            </w:r>
+            <w:r>
+              <w:rPr>
+                <w:b w:val="0"/>
+                <w:sz w:val="17"/>
+              </w:rPr>
+              <w:t>Notifica feedback</w:t>
+            </w:r>
+          </w:p>
+        </w:tc>
+        <w:tc>
+          <w:tcPr>
+            <w:tcW w:type="dxa" w:w="3408"/>
+            <w:vAlign w:val="top"/>
+          </w:tcPr>
+          <w:p>
+            <w:r>
+              <w:rPr>
+                <w:sz w:val="17"/>
+              </w:rPr>
+            </w:r>
+            <w:r>
+              <w:rPr>
+                <w:b w:val="0"/>
+                <w:sz w:val="17"/>
+              </w:rPr>
+              <w:t>Centro notifiche se persistita con audience</w:t>
+            </w:r>
+          </w:p>
+        </w:tc>
+        <w:tc>
+          <w:tcPr>
+            <w:tcW w:type="dxa" w:w="3408"/>
+            <w:vAlign w:val="top"/>
+          </w:tcPr>
+          <w:p>
+            <w:r>
+              <w:rPr>
+                <w:sz w:val="17"/>
+              </w:rPr>
+            </w:r>
+            <w:r>
+              <w:rPr>
+                <w:b w:val="0"/>
+                <w:sz w:val="17"/>
+              </w:rPr>
+              <w:t>Messaggi generici indirizzati a un ruolo operativo.</w:t>
+            </w:r>
+          </w:p>
+        </w:tc>
+      </w:tr>
+    </w:tbl>
+    <w:tbl>
+      <w:tblPr>
+        <w:tblStyle w:val="TableGrid"/>
+        <w:tblW w:type="auto" w:w="0"/>
+        <w:jc w:val="center"/>
+        <w:tblLook w:firstColumn="1" w:firstRow="1" w:lastColumn="0" w:lastRow="0" w:noHBand="0" w:noVBand="1" w:val="04A0"/>
+      </w:tblPr>
+      <w:tblGrid>
+        <w:gridCol w:w="3408"/>
+        <w:gridCol w:w="3408"/>
+        <w:gridCol w:w="3408"/>
+      </w:tblGrid>
+      <w:tr>
+        <w:tc>
+          <w:tcPr>
+            <w:tcW w:type="dxa" w:w="3408"/>
+            <w:vAlign w:val="top"/>
+            <w:shd w:fill="D9F1F2"/>
+          </w:tcPr>
+          <w:p>
+            <w:r>
+              <w:rPr>
+                <w:sz w:val="17"/>
+              </w:rPr>
+            </w:r>
+            <w:r>
+              <w:rPr>
+                <w:b/>
+                <w:sz w:val="17"/>
+              </w:rPr>
+              <w:t>Campo</w:t>
+            </w:r>
+          </w:p>
+        </w:tc>
+        <w:tc>
+          <w:tcPr>
+            <w:tcW w:type="dxa" w:w="3408"/>
+            <w:vAlign w:val="top"/>
+            <w:shd w:fill="D9F1F2"/>
+          </w:tcPr>
+          <w:p>
+            <w:r>
+              <w:rPr>
+                <w:sz w:val="17"/>
+              </w:rPr>
+            </w:r>
+            <w:r>
+              <w:rPr>
+                <w:b/>
+                <w:sz w:val="17"/>
+              </w:rPr>
+              <w:t>Valori</w:t>
+            </w:r>
+          </w:p>
+        </w:tc>
+        <w:tc>
+          <w:tcPr>
+            <w:tcW w:type="dxa" w:w="3408"/>
+            <w:vAlign w:val="top"/>
+            <w:shd w:fill="D9F1F2"/>
+          </w:tcPr>
+          <w:p>
+            <w:r>
+              <w:rPr>
+                <w:sz w:val="17"/>
+              </w:rPr>
+            </w:r>
+            <w:r>
+              <w:rPr>
+                <w:b/>
+                <w:sz w:val="17"/>
+              </w:rPr>
+              <w:t>Regola</w:t>
+            </w:r>
+          </w:p>
+        </w:tc>
+      </w:tr>
+      <w:tr>
+        <w:tc>
+          <w:tcPr>
+            <w:tcW w:type="dxa" w:w="3408"/>
+            <w:vAlign w:val="top"/>
+          </w:tcPr>
+          <w:p>
+            <w:r>
+              <w:rPr>
+                <w:sz w:val="17"/>
+              </w:rPr>
+            </w:r>
+            <w:r>
+              <w:rPr>
+                <w:b w:val="0"/>
+                <w:sz w:val="17"/>
+              </w:rPr>
+              <w:t>Audience</w:t>
+            </w:r>
+          </w:p>
+        </w:tc>
+        <w:tc>
+          <w:tcPr>
+            <w:tcW w:type="dxa" w:w="3408"/>
+            <w:vAlign w:val="top"/>
+          </w:tcPr>
+          <w:p>
+            <w:r>
+              <w:rPr>
+                <w:sz w:val="17"/>
+              </w:rPr>
+            </w:r>
+            <w:r>
+              <w:rPr>
+                <w:b w:val="0"/>
+                <w:sz w:val="17"/>
+              </w:rPr>
+              <w:t>FunniFin, Esperto, Brand</w:t>
+            </w:r>
+          </w:p>
+        </w:tc>
+        <w:tc>
+          <w:tcPr>
+            <w:tcW w:type="dxa" w:w="3408"/>
+            <w:vAlign w:val="top"/>
+          </w:tcPr>
+          <w:p>
+            <w:r>
+              <w:rPr>
+                <w:sz w:val="17"/>
+              </w:rPr>
+            </w:r>
+            <w:r>
+              <w:rPr>
+                <w:b w:val="0"/>
+                <w:sz w:val="17"/>
+              </w:rPr>
+              <w:t>Solo questi ruoli possono ricevere notifiche persistenti; Cliente escluso.</w:t>
+            </w:r>
+          </w:p>
+        </w:tc>
+      </w:tr>
+      <w:tr>
+        <w:tc>
+          <w:tcPr>
+            <w:tcW w:type="dxa" w:w="3408"/>
+            <w:vAlign w:val="top"/>
+          </w:tcPr>
+          <w:p>
+            <w:r>
+              <w:rPr>
+                <w:sz w:val="17"/>
+              </w:rPr>
+            </w:r>
+            <w:r>
+              <w:rPr>
+                <w:b w:val="0"/>
+                <w:sz w:val="17"/>
+              </w:rPr>
+              <w:t>Priority</w:t>
+            </w:r>
+          </w:p>
+        </w:tc>
+        <w:tc>
+          <w:tcPr>
+            <w:tcW w:type="dxa" w:w="3408"/>
+            <w:vAlign w:val="top"/>
+          </w:tcPr>
+          <w:p>
+            <w:r>
+              <w:rPr>
+                <w:sz w:val="17"/>
+              </w:rPr>
+            </w:r>
+            <w:r>
+              <w:rPr>
+                <w:b w:val="0"/>
+                <w:sz w:val="17"/>
+              </w:rPr>
+              <w:t>critical, task, info</w:t>
+            </w:r>
+          </w:p>
+        </w:tc>
+        <w:tc>
+          <w:tcPr>
+            <w:tcW w:type="dxa" w:w="3408"/>
+            <w:vAlign w:val="top"/>
+          </w:tcPr>
+          <w:p>
+            <w:r>
+              <w:rPr>
+                <w:sz w:val="17"/>
+              </w:rPr>
+            </w:r>
+            <w:r>
+              <w:rPr>
+                <w:b w:val="0"/>
+                <w:sz w:val="17"/>
+              </w:rPr>
+              <w:t>critical attiva stile urgente; task entra nel tab Da fare; info resta informativa.</w:t>
+            </w:r>
+          </w:p>
+        </w:tc>
+      </w:tr>
+      <w:tr>
+        <w:tc>
+          <w:tcPr>
+            <w:tcW w:type="dxa" w:w="3408"/>
+            <w:vAlign w:val="top"/>
+          </w:tcPr>
+          <w:p>
+            <w:r>
+              <w:rPr>
+                <w:sz w:val="17"/>
+              </w:rPr>
+            </w:r>
+            <w:r>
+              <w:rPr>
+                <w:b w:val="0"/>
+                <w:sz w:val="17"/>
+              </w:rPr>
+              <w:t>Category</w:t>
+            </w:r>
+          </w:p>
+        </w:tc>
+        <w:tc>
+          <w:tcPr>
+            <w:tcW w:type="dxa" w:w="3408"/>
+            <w:vAlign w:val="top"/>
+          </w:tcPr>
+          <w:p>
+            <w:r>
+              <w:rPr>
+                <w:sz w:val="17"/>
+              </w:rPr>
+            </w:r>
+            <w:r>
+              <w:rPr>
+                <w:b w:val="0"/>
+                <w:sz w:val="17"/>
+              </w:rPr>
+              <w:t>task, mail, system, feedback</w:t>
+            </w:r>
+          </w:p>
+        </w:tc>
+        <w:tc>
+          <w:tcPr>
+            <w:tcW w:type="dxa" w:w="3408"/>
+            <w:vAlign w:val="top"/>
+          </w:tcPr>
+          <w:p>
+            <w:r>
+              <w:rPr>
+                <w:sz w:val="17"/>
+              </w:rPr>
+            </w:r>
+            <w:r>
+              <w:rPr>
+                <w:b w:val="0"/>
+                <w:sz w:val="17"/>
+              </w:rPr>
+              <w:t>Guida icona, tag e filtri chip.</w:t>
+            </w:r>
+          </w:p>
+        </w:tc>
+      </w:tr>
+      <w:tr>
+        <w:tc>
+          <w:tcPr>
+            <w:tcW w:type="dxa" w:w="3408"/>
+            <w:vAlign w:val="top"/>
+          </w:tcPr>
+          <w:p>
+            <w:r>
+              <w:rPr>
+                <w:sz w:val="17"/>
+              </w:rPr>
+            </w:r>
+            <w:r>
+              <w:rPr>
+                <w:b w:val="0"/>
+                <w:sz w:val="17"/>
+              </w:rPr>
+              <w:t>Status</w:t>
+            </w:r>
+          </w:p>
+        </w:tc>
+        <w:tc>
+          <w:tcPr>
+            <w:tcW w:type="dxa" w:w="3408"/>
+            <w:vAlign w:val="top"/>
+          </w:tcPr>
+          <w:p>
+            <w:r>
+              <w:rPr>
+                <w:sz w:val="17"/>
+              </w:rPr>
+            </w:r>
+            <w:r>
+              <w:rPr>
+                <w:b w:val="0"/>
+                <w:sz w:val="17"/>
+              </w:rPr>
+              <w:t>open, closed</w:t>
+            </w:r>
+          </w:p>
+        </w:tc>
+        <w:tc>
+          <w:tcPr>
+            <w:tcW w:type="dxa" w:w="3408"/>
+            <w:vAlign w:val="top"/>
+          </w:tcPr>
+          <w:p>
+            <w:r>
+              <w:rPr>
+                <w:sz w:val="17"/>
+              </w:rPr>
+            </w:r>
+            <w:r>
+              <w:rPr>
+                <w:b w:val="0"/>
+                <w:sz w:val="17"/>
+              </w:rPr>
+              <w:t>Open conta nei badge; closed entra in Chiuse ed è riapribile.</w:t>
+            </w:r>
+          </w:p>
+        </w:tc>
+      </w:tr>
+      <w:tr>
+        <w:tc>
+          <w:tcPr>
+            <w:tcW w:type="dxa" w:w="3408"/>
+            <w:vAlign w:val="top"/>
+          </w:tcPr>
+          <w:p>
+            <w:r>
+              <w:rPr>
+                <w:sz w:val="17"/>
+              </w:rPr>
+            </w:r>
+            <w:r>
+              <w:rPr>
+                <w:b w:val="0"/>
+                <w:sz w:val="17"/>
+              </w:rPr>
+              <w:t>Read</w:t>
+            </w:r>
+          </w:p>
+        </w:tc>
+        <w:tc>
+          <w:tcPr>
+            <w:tcW w:type="dxa" w:w="3408"/>
+            <w:vAlign w:val="top"/>
+          </w:tcPr>
+          <w:p>
+            <w:r>
+              <w:rPr>
+                <w:sz w:val="17"/>
+              </w:rPr>
+            </w:r>
+            <w:r>
+              <w:rPr>
+                <w:b w:val="0"/>
+                <w:sz w:val="17"/>
+              </w:rPr>
+              <w:t>readBy e readByUserIds</w:t>
+            </w:r>
+          </w:p>
+        </w:tc>
+        <w:tc>
+          <w:tcPr>
+            <w:tcW w:type="dxa" w:w="3408"/>
+            <w:vAlign w:val="top"/>
+          </w:tcPr>
+          <w:p>
+            <w:r>
+              <w:rPr>
+                <w:sz w:val="17"/>
+              </w:rPr>
+            </w:r>
+            <w:r>
+              <w:rPr>
+                <w:b w:val="0"/>
+                <w:sz w:val="17"/>
+              </w:rPr>
+              <w:t>Apertura pannello marca visibili come lette; il badge considera utente/email quando disponibili.</w:t>
+            </w:r>
+          </w:p>
+        </w:tc>
+      </w:tr>
+      <w:tr>
+        <w:tc>
+          <w:tcPr>
+            <w:tcW w:type="dxa" w:w="3408"/>
+            <w:vAlign w:val="top"/>
+          </w:tcPr>
+          <w:p>
+            <w:r>
+              <w:rPr>
+                <w:sz w:val="17"/>
+              </w:rPr>
+            </w:r>
+            <w:r>
+              <w:rPr>
+                <w:b w:val="0"/>
+                <w:sz w:val="17"/>
+              </w:rPr>
+              <w:t>Action</w:t>
+            </w:r>
+          </w:p>
+        </w:tc>
+        <w:tc>
+          <w:tcPr>
+            <w:tcW w:type="dxa" w:w="3408"/>
+            <w:vAlign w:val="top"/>
+          </w:tcPr>
+          <w:p>
+            <w:r>
+              <w:rPr>
+                <w:sz w:val="17"/>
+              </w:rPr>
+            </w:r>
+            <w:r>
+              <w:rPr>
+                <w:b w:val="0"/>
+                <w:sz w:val="17"/>
+              </w:rPr>
+              <w:t>label, role, hash, section, projectId</w:t>
+            </w:r>
+          </w:p>
+        </w:tc>
+        <w:tc>
+          <w:tcPr>
+            <w:tcW w:type="dxa" w:w="3408"/>
+            <w:vAlign w:val="top"/>
+          </w:tcPr>
+          <w:p>
+            <w:r>
+              <w:rPr>
+                <w:sz w:val="17"/>
+              </w:rPr>
+            </w:r>
+            <w:r>
+              <w:rPr>
+                <w:b w:val="0"/>
+                <w:sz w:val="17"/>
+              </w:rPr>
+              <w:t>Il click marca letta, cambia ruolo se FunniFin impersona, naviga a hash/sezione/progetto e chiude il pannello.</w:t>
+            </w:r>
+          </w:p>
+        </w:tc>
+      </w:tr>
+    </w:tbl>
+    <w:p>
+      <w:r>
+        <w:rPr>
+          <w:b/>
+        </w:rPr>
+        <w:t xml:space="preserve">Badge: </w:t>
+      </w:r>
+      <w:r>
+        <w:t>Il numero sulla campanella conta le notifiche aperte visibili per quel ruolo/utente. Sopra 9 mostra 9+. Se esiste una critical aperta, la campanella assume stato urgent/pulse.</w:t>
+      </w:r>
+    </w:p>
+    <w:p>
+      <w:r>
+        <w:rPr>
+          <w:b/>
+        </w:rPr>
+        <w:t xml:space="preserve">Archivio: </w:t>
+      </w:r>
+      <w:r>
+        <w:t>Archivia non cancella la notifica: passa a status closed. Nel tab Chiuse si può riaprire o svuotare l’archivio chiuso del ruolo.</w:t>
+      </w:r>
+    </w:p>
+    <w:p>
+      <w:pPr>
+        <w:pStyle w:val="Heading1"/>
+      </w:pPr>
+      <w:r>
+        <w:t>13. Mail inviate e destinatari</w:t>
+      </w:r>
+    </w:p>
+    <w:p>
+      <w:r>
+        <w:t>Le mail sono due famiglie: recap della richiesta Cliente e notifiche workflow. Entrambe passano da Apps Script quando VITE_GOOGLE_APP_SCRIPT_URL è configurato; in demo/fallback l’app può produrre contenuto pronto o invio opaque, ma deve segnalare lo stato a FunniFin.</w:t>
+      </w:r>
+    </w:p>
+    <w:tbl>
+      <w:tblPr>
+        <w:tblStyle w:val="TableGrid"/>
+        <w:tblW w:type="auto" w:w="0"/>
+        <w:jc w:val="center"/>
+        <w:tblLook w:firstColumn="1" w:firstRow="1" w:lastColumn="0" w:lastRow="0" w:noHBand="0" w:noVBand="1" w:val="04A0"/>
+      </w:tblPr>
+      <w:tblGrid>
+        <w:gridCol w:w="2045"/>
+        <w:gridCol w:w="2045"/>
+        <w:gridCol w:w="2045"/>
+        <w:gridCol w:w="2045"/>
+        <w:gridCol w:w="2045"/>
+      </w:tblGrid>
+      <w:tr>
+        <w:tc>
+          <w:tcPr>
+            <w:tcW w:type="dxa" w:w="2045"/>
+            <w:vAlign w:val="top"/>
+            <w:shd w:fill="D9F1F2"/>
+          </w:tcPr>
+          <w:p>
+            <w:r>
+              <w:rPr>
+                <w:sz w:val="17"/>
+              </w:rPr>
+            </w:r>
+            <w:r>
+              <w:rPr>
+                <w:b/>
+                <w:sz w:val="17"/>
+              </w:rPr>
+              <w:t>Famiglia</w:t>
+            </w:r>
+          </w:p>
+        </w:tc>
+        <w:tc>
+          <w:tcPr>
+            <w:tcW w:type="dxa" w:w="2045"/>
+            <w:vAlign w:val="top"/>
+            <w:shd w:fill="D9F1F2"/>
+          </w:tcPr>
+          <w:p>
+            <w:r>
+              <w:rPr>
+                <w:sz w:val="17"/>
+              </w:rPr>
+            </w:r>
+            <w:r>
+              <w:rPr>
+                <w:b/>
+                <w:sz w:val="17"/>
+              </w:rPr>
+              <w:t>Funzione</w:t>
+            </w:r>
+          </w:p>
+        </w:tc>
+        <w:tc>
+          <w:tcPr>
+            <w:tcW w:type="dxa" w:w="2045"/>
+            <w:vAlign w:val="top"/>
+            <w:shd w:fill="D9F1F2"/>
+          </w:tcPr>
+          <w:p>
+            <w:r>
+              <w:rPr>
+                <w:sz w:val="17"/>
+              </w:rPr>
+            </w:r>
+            <w:r>
+              <w:rPr>
+                <w:b/>
+                <w:sz w:val="17"/>
+              </w:rPr>
+              <w:t>Oggetto</w:t>
+            </w:r>
+          </w:p>
+        </w:tc>
+        <w:tc>
+          <w:tcPr>
+            <w:tcW w:type="dxa" w:w="2045"/>
+            <w:vAlign w:val="top"/>
+            <w:shd w:fill="D9F1F2"/>
+          </w:tcPr>
+          <w:p>
+            <w:r>
+              <w:rPr>
+                <w:sz w:val="17"/>
+              </w:rPr>
+            </w:r>
+            <w:r>
+              <w:rPr>
+                <w:b/>
+                <w:sz w:val="17"/>
+              </w:rPr>
+              <w:t>Destinatari</w:t>
+            </w:r>
+          </w:p>
+        </w:tc>
+        <w:tc>
+          <w:tcPr>
+            <w:tcW w:type="dxa" w:w="2045"/>
+            <w:vAlign w:val="top"/>
+            <w:shd w:fill="D9F1F2"/>
+          </w:tcPr>
+          <w:p>
+            <w:r>
+              <w:rPr>
+                <w:sz w:val="17"/>
+              </w:rPr>
+            </w:r>
+            <w:r>
+              <w:rPr>
+                <w:b/>
+                <w:sz w:val="17"/>
+              </w:rPr>
+              <w:t>Contenuto</w:t>
+            </w:r>
+          </w:p>
+        </w:tc>
+      </w:tr>
+      <w:tr>
+        <w:tc>
+          <w:tcPr>
+            <w:tcW w:type="dxa" w:w="2045"/>
+            <w:vAlign w:val="top"/>
+          </w:tcPr>
+          <w:p>
+            <w:r>
+              <w:rPr>
+                <w:sz w:val="17"/>
+              </w:rPr>
+            </w:r>
+            <w:r>
+              <w:rPr>
+                <w:b w:val="0"/>
+                <w:sz w:val="17"/>
+              </w:rPr>
+              <w:t>Richiesta cliente</w:t>
+            </w:r>
+          </w:p>
+        </w:tc>
+        <w:tc>
+          <w:tcPr>
+            <w:tcW w:type="dxa" w:w="2045"/>
+            <w:vAlign w:val="top"/>
+          </w:tcPr>
+          <w:p>
+            <w:r>
+              <w:rPr>
+                <w:sz w:val="17"/>
+              </w:rPr>
+            </w:r>
+            <w:r>
+              <w:rPr>
+                <w:b w:val="0"/>
+                <w:sz w:val="17"/>
+              </w:rPr>
+              <w:t>sendWorkshopRequestEmail</w:t>
+            </w:r>
+          </w:p>
+        </w:tc>
+        <w:tc>
+          <w:tcPr>
+            <w:tcW w:type="dxa" w:w="2045"/>
+            <w:vAlign w:val="top"/>
+          </w:tcPr>
+          <w:p>
+            <w:r>
+              <w:rPr>
+                <w:sz w:val="17"/>
+              </w:rPr>
+            </w:r>
+            <w:r>
+              <w:rPr>
+                <w:b w:val="0"/>
+                <w:sz w:val="17"/>
+              </w:rPr>
+              <w:t>Richiesta workshop FunniFin - &lt;azienda&gt;</w:t>
+            </w:r>
+          </w:p>
+        </w:tc>
+        <w:tc>
+          <w:tcPr>
+            <w:tcW w:type="dxa" w:w="2045"/>
+            <w:vAlign w:val="top"/>
+          </w:tcPr>
+          <w:p>
+            <w:r>
+              <w:rPr>
+                <w:sz w:val="17"/>
+              </w:rPr>
+            </w:r>
+            <w:r>
+              <w:rPr>
+                <w:b w:val="0"/>
+                <w:sz w:val="17"/>
+              </w:rPr>
+              <w:t>Cliente in TO; FunniFin interno in CC/config mail.cc</w:t>
+            </w:r>
+          </w:p>
+        </w:tc>
+        <w:tc>
+          <w:tcPr>
+            <w:tcW w:type="dxa" w:w="2045"/>
+            <w:vAlign w:val="top"/>
+          </w:tcPr>
+          <w:p>
+            <w:r>
+              <w:rPr>
+                <w:sz w:val="17"/>
+              </w:rPr>
+            </w:r>
+            <w:r>
+              <w:rPr>
+                <w:b w:val="0"/>
+                <w:sz w:val="17"/>
+              </w:rPr>
+              <w:t>Dati referente, workshop, date, preventivo, prossimi passi.</w:t>
+            </w:r>
+          </w:p>
+        </w:tc>
+      </w:tr>
+      <w:tr>
+        <w:tc>
+          <w:tcPr>
+            <w:tcW w:type="dxa" w:w="2045"/>
+            <w:vAlign w:val="top"/>
+          </w:tcPr>
+          <w:p>
+            <w:r>
+              <w:rPr>
+                <w:sz w:val="17"/>
+              </w:rPr>
+            </w:r>
+            <w:r>
+              <w:rPr>
+                <w:b w:val="0"/>
+                <w:sz w:val="17"/>
+              </w:rPr>
+              <w:t>Workflow</w:t>
+            </w:r>
+          </w:p>
+        </w:tc>
+        <w:tc>
+          <w:tcPr>
+            <w:tcW w:type="dxa" w:w="2045"/>
+            <w:vAlign w:val="top"/>
+          </w:tcPr>
+          <w:p>
+            <w:r>
+              <w:rPr>
+                <w:sz w:val="17"/>
+              </w:rPr>
+            </w:r>
+            <w:r>
+              <w:rPr>
+                <w:b w:val="0"/>
+                <w:sz w:val="17"/>
+              </w:rPr>
+              <w:t>sendWorkflowNotification</w:t>
+            </w:r>
+          </w:p>
+        </w:tc>
+        <w:tc>
+          <w:tcPr>
+            <w:tcW w:type="dxa" w:w="2045"/>
+            <w:vAlign w:val="top"/>
+          </w:tcPr>
+          <w:p>
+            <w:r>
+              <w:rPr>
+                <w:sz w:val="17"/>
+              </w:rPr>
+            </w:r>
+            <w:r>
+              <w:rPr>
+                <w:b w:val="0"/>
+                <w:sz w:val="17"/>
+              </w:rPr>
+              <w:t>FunniFin - &lt;azienda&gt; - &lt;phase&gt;</w:t>
+            </w:r>
+          </w:p>
+        </w:tc>
+        <w:tc>
+          <w:tcPr>
+            <w:tcW w:type="dxa" w:w="2045"/>
+            <w:vAlign w:val="top"/>
+          </w:tcPr>
+          <w:p>
+            <w:r>
+              <w:rPr>
+                <w:sz w:val="17"/>
+              </w:rPr>
+            </w:r>
+            <w:r>
+              <w:rPr>
+                <w:b w:val="0"/>
+                <w:sz w:val="17"/>
+              </w:rPr>
+              <w:t>Ruoli scelti nella modale: client, funnifin, expert, brand</w:t>
+            </w:r>
+          </w:p>
+        </w:tc>
+        <w:tc>
+          <w:tcPr>
+            <w:tcW w:type="dxa" w:w="2045"/>
+            <w:vAlign w:val="top"/>
+          </w:tcPr>
+          <w:p>
+            <w:r>
+              <w:rPr>
+                <w:sz w:val="17"/>
+              </w:rPr>
+            </w:r>
+            <w:r>
+              <w:rPr>
+                <w:b w:val="0"/>
+                <w:sz w:val="17"/>
+              </w:rPr>
+              <w:t>Stato progetto, workshop/date, note operative, link azione, eventuale evento/Meet.</w:t>
+            </w:r>
+          </w:p>
+        </w:tc>
+      </w:tr>
+    </w:tbl>
+    <w:tbl>
+      <w:tblPr>
+        <w:tblStyle w:val="TableGrid"/>
+        <w:tblW w:type="auto" w:w="0"/>
+        <w:jc w:val="center"/>
+        <w:tblLook w:firstColumn="1" w:firstRow="1" w:lastColumn="0" w:lastRow="0" w:noHBand="0" w:noVBand="1" w:val="04A0"/>
+      </w:tblPr>
+      <w:tblGrid>
+        <w:gridCol w:w="3408"/>
+        <w:gridCol w:w="3408"/>
+        <w:gridCol w:w="3408"/>
+      </w:tblGrid>
+      <w:tr>
+        <w:tc>
+          <w:tcPr>
+            <w:tcW w:type="dxa" w:w="3408"/>
+            <w:vAlign w:val="top"/>
+            <w:shd w:fill="D9F1F2"/>
+          </w:tcPr>
+          <w:p>
+            <w:r>
+              <w:rPr>
+                <w:sz w:val="17"/>
+              </w:rPr>
+            </w:r>
+            <w:r>
+              <w:rPr>
+                <w:b/>
+                <w:sz w:val="17"/>
+              </w:rPr>
+              <w:t>Fase/modale</w:t>
+            </w:r>
+          </w:p>
+        </w:tc>
+        <w:tc>
+          <w:tcPr>
+            <w:tcW w:type="dxa" w:w="3408"/>
+            <w:vAlign w:val="top"/>
+            <w:shd w:fill="D9F1F2"/>
+          </w:tcPr>
+          <w:p>
+            <w:r>
+              <w:rPr>
+                <w:sz w:val="17"/>
+              </w:rPr>
+            </w:r>
+            <w:r>
+              <w:rPr>
+                <w:b/>
+                <w:sz w:val="17"/>
+              </w:rPr>
+              <w:t>Destinatari precompilati</w:t>
+            </w:r>
+          </w:p>
+        </w:tc>
+        <w:tc>
+          <w:tcPr>
+            <w:tcW w:type="dxa" w:w="3408"/>
+            <w:vAlign w:val="top"/>
+            <w:shd w:fill="D9F1F2"/>
+          </w:tcPr>
+          <w:p>
+            <w:r>
+              <w:rPr>
+                <w:sz w:val="17"/>
+              </w:rPr>
+            </w:r>
+            <w:r>
+              <w:rPr>
+                <w:b/>
+                <w:sz w:val="17"/>
+              </w:rPr>
+              <w:t>Nota importante</w:t>
+            </w:r>
+          </w:p>
+        </w:tc>
+      </w:tr>
+      <w:tr>
+        <w:tc>
+          <w:tcPr>
+            <w:tcW w:type="dxa" w:w="3408"/>
+            <w:vAlign w:val="top"/>
+          </w:tcPr>
+          <w:p>
+            <w:r>
+              <w:rPr>
+                <w:sz w:val="17"/>
+              </w:rPr>
+            </w:r>
+            <w:r>
+              <w:rPr>
+                <w:b w:val="0"/>
+                <w:sz w:val="17"/>
+              </w:rPr>
+              <w:t>Modifica richiesta</w:t>
+            </w:r>
+          </w:p>
+        </w:tc>
+        <w:tc>
+          <w:tcPr>
+            <w:tcW w:type="dxa" w:w="3408"/>
+            <w:vAlign w:val="top"/>
+          </w:tcPr>
+          <w:p>
+            <w:r>
+              <w:rPr>
+                <w:sz w:val="17"/>
+              </w:rPr>
+            </w:r>
+            <w:r>
+              <w:rPr>
+                <w:b w:val="0"/>
+                <w:sz w:val="17"/>
+              </w:rPr>
+              <w:t>client + funnifin</w:t>
+            </w:r>
+          </w:p>
+        </w:tc>
+        <w:tc>
+          <w:tcPr>
+            <w:tcW w:type="dxa" w:w="3408"/>
+            <w:vAlign w:val="top"/>
+          </w:tcPr>
+          <w:p>
+            <w:r>
+              <w:rPr>
+                <w:sz w:val="17"/>
+              </w:rPr>
+            </w:r>
+            <w:r>
+              <w:rPr>
+                <w:b w:val="0"/>
+                <w:sz w:val="17"/>
+              </w:rPr>
+              <w:t>Toggle invio spento di default; FunniFin decide se spedire.</w:t>
+            </w:r>
+          </w:p>
+        </w:tc>
+      </w:tr>
+      <w:tr>
+        <w:tc>
+          <w:tcPr>
+            <w:tcW w:type="dxa" w:w="3408"/>
+            <w:vAlign w:val="top"/>
+          </w:tcPr>
+          <w:p>
+            <w:r>
+              <w:rPr>
+                <w:sz w:val="17"/>
+              </w:rPr>
+            </w:r>
+            <w:r>
+              <w:rPr>
+                <w:b w:val="0"/>
+                <w:sz w:val="17"/>
+              </w:rPr>
+              <w:t>Data approvata</w:t>
+            </w:r>
+          </w:p>
+        </w:tc>
+        <w:tc>
+          <w:tcPr>
+            <w:tcW w:type="dxa" w:w="3408"/>
+            <w:vAlign w:val="top"/>
+          </w:tcPr>
+          <w:p>
+            <w:r>
+              <w:rPr>
+                <w:sz w:val="17"/>
+              </w:rPr>
+            </w:r>
+            <w:r>
+              <w:rPr>
+                <w:b w:val="0"/>
+                <w:sz w:val="17"/>
+              </w:rPr>
+              <w:t>client + funnifin se tutte le date risultano complete, altrimenti funnifin</w:t>
+            </w:r>
+          </w:p>
+        </w:tc>
+        <w:tc>
+          <w:tcPr>
+            <w:tcW w:type="dxa" w:w="3408"/>
+            <w:vAlign w:val="top"/>
+          </w:tcPr>
+          <w:p>
+            <w:r>
+              <w:rPr>
+                <w:sz w:val="17"/>
+              </w:rPr>
+            </w:r>
+            <w:r>
+              <w:rPr>
+                <w:b w:val="0"/>
+                <w:sz w:val="17"/>
+              </w:rPr>
+              <w:t>Evita aggiornamenti parziali al cliente quando restano date incomplete.</w:t>
+            </w:r>
+          </w:p>
+        </w:tc>
+      </w:tr>
+      <w:tr>
+        <w:tc>
+          <w:tcPr>
+            <w:tcW w:type="dxa" w:w="3408"/>
+            <w:vAlign w:val="top"/>
+          </w:tcPr>
+          <w:p>
+            <w:r>
+              <w:rPr>
+                <w:sz w:val="17"/>
+              </w:rPr>
+            </w:r>
+            <w:r>
+              <w:rPr>
+                <w:b w:val="0"/>
+                <w:sz w:val="17"/>
+              </w:rPr>
+              <w:t>Modifica data richiesta</w:t>
+            </w:r>
+          </w:p>
+        </w:tc>
+        <w:tc>
+          <w:tcPr>
+            <w:tcW w:type="dxa" w:w="3408"/>
+            <w:vAlign w:val="top"/>
+          </w:tcPr>
+          <w:p>
+            <w:r>
+              <w:rPr>
+                <w:sz w:val="17"/>
+              </w:rPr>
+            </w:r>
+            <w:r>
+              <w:rPr>
+                <w:b w:val="0"/>
+                <w:sz w:val="17"/>
+              </w:rPr>
+              <w:t>funnifin</w:t>
+            </w:r>
+          </w:p>
+        </w:tc>
+        <w:tc>
+          <w:tcPr>
+            <w:tcW w:type="dxa" w:w="3408"/>
+            <w:vAlign w:val="top"/>
+          </w:tcPr>
+          <w:p>
+            <w:r>
+              <w:rPr>
+                <w:sz w:val="17"/>
+              </w:rPr>
+            </w:r>
+            <w:r>
+              <w:rPr>
+                <w:b w:val="0"/>
+                <w:sz w:val="17"/>
+              </w:rPr>
+              <w:t>Default conservativo/editabile nella modale; nota spiega nuova proposta necessaria.</w:t>
+            </w:r>
+          </w:p>
+        </w:tc>
+      </w:tr>
+      <w:tr>
+        <w:tc>
+          <w:tcPr>
+            <w:tcW w:type="dxa" w:w="3408"/>
+            <w:vAlign w:val="top"/>
+          </w:tcPr>
+          <w:p>
+            <w:r>
+              <w:rPr>
+                <w:sz w:val="17"/>
+              </w:rPr>
+            </w:r>
+            <w:r>
+              <w:rPr>
+                <w:b w:val="0"/>
+                <w:sz w:val="17"/>
+              </w:rPr>
+              <w:t>Assegna esperto</w:t>
+            </w:r>
+          </w:p>
+        </w:tc>
+        <w:tc>
+          <w:tcPr>
+            <w:tcW w:type="dxa" w:w="3408"/>
+            <w:vAlign w:val="top"/>
+          </w:tcPr>
+          <w:p>
+            <w:r>
+              <w:rPr>
+                <w:sz w:val="17"/>
+              </w:rPr>
+            </w:r>
+            <w:r>
+              <w:rPr>
+                <w:b w:val="0"/>
+                <w:sz w:val="17"/>
+              </w:rPr>
+              <w:t>funnifin</w:t>
+            </w:r>
+          </w:p>
+        </w:tc>
+        <w:tc>
+          <w:tcPr>
+            <w:tcW w:type="dxa" w:w="3408"/>
+            <w:vAlign w:val="top"/>
+          </w:tcPr>
+          <w:p>
+            <w:r>
+              <w:rPr>
+                <w:sz w:val="17"/>
+              </w:rPr>
+            </w:r>
+            <w:r>
+              <w:rPr>
+                <w:b w:val="0"/>
+                <w:sz w:val="17"/>
+              </w:rPr>
+              <w:t>L’assegnazione può generare anche notifica task interna o verso esperto se scelta.</w:t>
+            </w:r>
+          </w:p>
+        </w:tc>
+      </w:tr>
+      <w:tr>
+        <w:tc>
+          <w:tcPr>
+            <w:tcW w:type="dxa" w:w="3408"/>
+            <w:vAlign w:val="top"/>
+          </w:tcPr>
+          <w:p>
+            <w:r>
+              <w:rPr>
+                <w:sz w:val="17"/>
+              </w:rPr>
+            </w:r>
+            <w:r>
+              <w:rPr>
+                <w:b w:val="0"/>
+                <w:sz w:val="17"/>
+              </w:rPr>
+              <w:t>Apri candidature</w:t>
+            </w:r>
+          </w:p>
+        </w:tc>
+        <w:tc>
+          <w:tcPr>
+            <w:tcW w:type="dxa" w:w="3408"/>
+            <w:vAlign w:val="top"/>
+          </w:tcPr>
+          <w:p>
+            <w:r>
+              <w:rPr>
+                <w:sz w:val="17"/>
+              </w:rPr>
+            </w:r>
+            <w:r>
+              <w:rPr>
+                <w:b w:val="0"/>
+                <w:sz w:val="17"/>
+              </w:rPr>
+              <w:t>expert</w:t>
+            </w:r>
+          </w:p>
+        </w:tc>
+        <w:tc>
+          <w:tcPr>
+            <w:tcW w:type="dxa" w:w="3408"/>
+            <w:vAlign w:val="top"/>
+          </w:tcPr>
+          <w:p>
+            <w:r>
+              <w:rPr>
+                <w:sz w:val="17"/>
+              </w:rPr>
+            </w:r>
+            <w:r>
+              <w:rPr>
+                <w:b w:val="0"/>
+                <w:sz w:val="17"/>
+              </w:rPr>
+              <w:t>Invita gli esperti/opportunità compatibili a candidarsi.</w:t>
+            </w:r>
+          </w:p>
+        </w:tc>
+      </w:tr>
+      <w:tr>
+        <w:tc>
+          <w:tcPr>
+            <w:tcW w:type="dxa" w:w="3408"/>
+            <w:vAlign w:val="top"/>
+          </w:tcPr>
+          <w:p>
+            <w:r>
+              <w:rPr>
+                <w:sz w:val="17"/>
+              </w:rPr>
+            </w:r>
+            <w:r>
+              <w:rPr>
+                <w:b w:val="0"/>
+                <w:sz w:val="17"/>
+              </w:rPr>
+              <w:t>Handoff Brand</w:t>
+            </w:r>
+          </w:p>
+        </w:tc>
+        <w:tc>
+          <w:tcPr>
+            <w:tcW w:type="dxa" w:w="3408"/>
+            <w:vAlign w:val="top"/>
+          </w:tcPr>
+          <w:p>
+            <w:r>
+              <w:rPr>
+                <w:sz w:val="17"/>
+              </w:rPr>
+            </w:r>
+            <w:r>
+              <w:rPr>
+                <w:b w:val="0"/>
+                <w:sz w:val="17"/>
+              </w:rPr>
+              <w:t>brand + funnifin</w:t>
+            </w:r>
+          </w:p>
+        </w:tc>
+        <w:tc>
+          <w:tcPr>
+            <w:tcW w:type="dxa" w:w="3408"/>
+            <w:vAlign w:val="top"/>
+          </w:tcPr>
+          <w:p>
+            <w:r>
+              <w:rPr>
+                <w:sz w:val="17"/>
+              </w:rPr>
+            </w:r>
+            <w:r>
+              <w:rPr>
+                <w:b w:val="0"/>
+                <w:sz w:val="17"/>
+              </w:rPr>
+              <w:t>Avvisa Brand della revisione materiali e mantiene FunniFin in copia operativa.</w:t>
+            </w:r>
+          </w:p>
+        </w:tc>
+      </w:tr>
+      <w:tr>
+        <w:tc>
+          <w:tcPr>
+            <w:tcW w:type="dxa" w:w="3408"/>
+            <w:vAlign w:val="top"/>
+          </w:tcPr>
+          <w:p>
+            <w:r>
+              <w:rPr>
+                <w:sz w:val="17"/>
+              </w:rPr>
+            </w:r>
+            <w:r>
+              <w:rPr>
+                <w:b w:val="0"/>
+                <w:sz w:val="17"/>
+              </w:rPr>
+              <w:t>Crea evento</w:t>
+            </w:r>
+          </w:p>
+        </w:tc>
+        <w:tc>
+          <w:tcPr>
+            <w:tcW w:type="dxa" w:w="3408"/>
+            <w:vAlign w:val="top"/>
+          </w:tcPr>
+          <w:p>
+            <w:r>
+              <w:rPr>
+                <w:sz w:val="17"/>
+              </w:rPr>
+            </w:r>
+            <w:r>
+              <w:rPr>
+                <w:b w:val="0"/>
+                <w:sz w:val="17"/>
+              </w:rPr>
+              <w:t>client + funnifin</w:t>
+            </w:r>
+          </w:p>
+        </w:tc>
+        <w:tc>
+          <w:tcPr>
+            <w:tcW w:type="dxa" w:w="3408"/>
+            <w:vAlign w:val="top"/>
+          </w:tcPr>
+          <w:p>
+            <w:r>
+              <w:rPr>
+                <w:sz w:val="17"/>
+              </w:rPr>
+            </w:r>
+            <w:r>
+              <w:rPr>
+                <w:b w:val="0"/>
+                <w:sz w:val="17"/>
+              </w:rPr>
+              <w:t>Può essere provvisorio o confermato; include Calendar/Meet quando presenti.</w:t>
+            </w:r>
+          </w:p>
+        </w:tc>
+      </w:tr>
+      <w:tr>
+        <w:tc>
+          <w:tcPr>
+            <w:tcW w:type="dxa" w:w="3408"/>
+            <w:vAlign w:val="top"/>
+          </w:tcPr>
+          <w:p>
+            <w:r>
+              <w:rPr>
+                <w:sz w:val="17"/>
+              </w:rPr>
+            </w:r>
+            <w:r>
+              <w:rPr>
+                <w:b w:val="0"/>
+                <w:sz w:val="17"/>
+              </w:rPr>
+              <w:t>Errore invio</w:t>
+            </w:r>
+          </w:p>
+        </w:tc>
+        <w:tc>
+          <w:tcPr>
+            <w:tcW w:type="dxa" w:w="3408"/>
+            <w:vAlign w:val="top"/>
+          </w:tcPr>
+          <w:p>
+            <w:r>
+              <w:rPr>
+                <w:sz w:val="17"/>
+              </w:rPr>
+            </w:r>
+            <w:r>
+              <w:rPr>
+                <w:b w:val="0"/>
+                <w:sz w:val="17"/>
+              </w:rPr>
+              <w:t>notifica FunniFin critical/mail</w:t>
+            </w:r>
+          </w:p>
+        </w:tc>
+        <w:tc>
+          <w:tcPr>
+            <w:tcW w:type="dxa" w:w="3408"/>
+            <w:vAlign w:val="top"/>
+          </w:tcPr>
+          <w:p>
+            <w:r>
+              <w:rPr>
+                <w:sz w:val="17"/>
+              </w:rPr>
+            </w:r>
+            <w:r>
+              <w:rPr>
+                <w:b w:val="0"/>
+                <w:sz w:val="17"/>
+              </w:rPr>
+              <w:t>Se Apps Script non conferma, FunniFin vede Email non inviata con azione Verifica Google.</w:t>
+            </w:r>
+          </w:p>
+        </w:tc>
+      </w:tr>
+    </w:tbl>
+    <w:p>
+      <w:r>
+        <w:rPr>
+          <w:b/>
+        </w:rPr>
+        <w:t xml:space="preserve">Fallback: </w:t>
+      </w:r>
+      <w:r>
+        <w:t>Se Apps Script non è configurato, sendWorkshopRequestEmail ritorna sent=false con html/text/recipients; se il POST JSON fallisce ma i fallback locali sono abilitati, l’app prova no-cors e marca opaque=true, quindi consegna da verificare.</w:t>
+      </w:r>
+    </w:p>
+    <w:p>
+      <w:pPr>
+        <w:pStyle w:val="Heading1"/>
+      </w:pPr>
+      <w:r>
+        <w:t>14. Atlante UI annotato</w:t>
+      </w:r>
+    </w:p>
+    <w:p>
+      <w:r>
+        <w:t>Le figure seguenti sono state rigenerate dalla UI corrente e annotate con pallini gialli numerati. Ogni legenda indica cosa controllare in test manuale e cosa spiegare all’utente operativo. Le immagini coprono viste complete, close-up e diagrammi dei comportamenti che non emergono da una sola schermata.</w:t>
+      </w:r>
+    </w:p>
+    <w:p>
+      <w:r>
+        <w:rPr>
+          <w:b/>
+          <w:sz w:val="20"/>
+        </w:rPr>
+        <w:t>Figura A01 - Accesso area riservata</w:t>
+      </w:r>
+    </w:p>
+    <w:p>
+      <w:r>
+        <w:drawing>
+          <wp:inline xmlns:a="http://schemas.openxmlformats.org/drawingml/2006/main" xmlns:pic="http://schemas.openxmlformats.org/drawingml/2006/picture">
+            <wp:extent cx="5897880" cy="4095750"/>
+            <wp:docPr id="7" name="Picture 7"/>
+            <wp:cNvGraphicFramePr>
+              <a:graphicFrameLocks noChangeAspect="1"/>
+            </wp:cNvGraphicFramePr>
+            <a:graphic>
+              <a:graphicData uri="http://schemas.openxmlformats.org/drawingml/2006/picture">
+                <pic:pic>
+                  <pic:nvPicPr>
+                    <pic:cNvPr id="0" name="fig-01-login-area-riservata.png"/>
+                    <pic:cNvPicPr/>
+                  </pic:nvPicPr>
+                  <pic:blipFill>
+                    <a:blip r:embed="rId22"/>
+                    <a:stretch>
+                      <a:fillRect/>
+                    </a:stretch>
+                  </pic:blipFill>
+                  <pic:spPr>
+                    <a:xfrm>
+                      <a:off x="0" y="0"/>
+                      <a:ext cx="5897880" cy="4095750"/>
+                    </a:xfrm>
+                    <a:prstGeom prst="rect"/>
+                  </pic:spPr>
+                </pic:pic>
+              </a:graphicData>
+            </a:graphic>
+          </wp:inline>
+        </w:drawing>
+      </w:r>
+    </w:p>
+    <w:p>
+      <w:pPr>
+        <w:pStyle w:val="ListBullet"/>
+      </w:pPr>
+      <w:r>
+        <w:t>1 Campo email abilitata.</w:t>
+      </w:r>
+    </w:p>
+    <w:p>
+      <w:pPr>
+        <w:pStyle w:val="ListBullet"/>
+      </w:pPr>
+      <w:r>
+        <w:t>2 Codice a 6 cifre inviato/validato da FunniFin.</w:t>
+      </w:r>
+    </w:p>
+    <w:p>
+      <w:pPr>
+        <w:pStyle w:val="ListBullet"/>
+      </w:pPr>
+      <w:r>
+        <w:t>3 Azione di ingresso o richiesta codice.</w:t>
+      </w:r>
+    </w:p>
+    <w:p>
+      <w:r>
+        <w:rPr>
+          <w:b/>
+          <w:sz w:val="20"/>
+        </w:rPr>
+        <w:t>Figura A02 - Cliente - partenza senza preselezioni</w:t>
+      </w:r>
+    </w:p>
+    <w:p>
+      <w:r>
+        <w:drawing>
+          <wp:inline xmlns:a="http://schemas.openxmlformats.org/drawingml/2006/main" xmlns:pic="http://schemas.openxmlformats.org/drawingml/2006/picture">
+            <wp:extent cx="4343400" cy="6587490"/>
+            <wp:docPr id="8" name="Picture 8"/>
+            <wp:cNvGraphicFramePr>
+              <a:graphicFrameLocks noChangeAspect="1"/>
+            </wp:cNvGraphicFramePr>
+            <a:graphic>
+              <a:graphicData uri="http://schemas.openxmlformats.org/drawingml/2006/picture">
+                <pic:pic>
+                  <pic:nvPicPr>
+                    <pic:cNvPr id="0" name="fig-02-cliente-partenza-vuota.png"/>
+                    <pic:cNvPicPr/>
+                  </pic:nvPicPr>
+                  <pic:blipFill>
+                    <a:blip r:embed="rId23"/>
+                    <a:stretch>
+                      <a:fillRect/>
+                    </a:stretch>
+                  </pic:blipFill>
+                  <pic:spPr>
+                    <a:xfrm>
+                      <a:off x="0" y="0"/>
+                      <a:ext cx="4343400" cy="6587490"/>
+                    </a:xfrm>
+                    <a:prstGeom prst="rect"/>
+                  </pic:spPr>
+                </pic:pic>
+              </a:graphicData>
+            </a:graphic>
+          </wp:inline>
+        </w:drawing>
+      </w:r>
+    </w:p>
+    <w:p>
+      <w:pPr>
+        <w:pStyle w:val="ListBullet"/>
+      </w:pPr>
+      <w:r>
+        <w:t>1 Stepper del percorso pubblico.</w:t>
+      </w:r>
+    </w:p>
+    <w:p>
+      <w:pPr>
+        <w:pStyle w:val="ListBullet"/>
+      </w:pPr>
+      <w:r>
+        <w:t>2 Stato iniziale: nessun interesse o tema preselezionato.</w:t>
+      </w:r>
+    </w:p>
+    <w:p>
+      <w:pPr>
+        <w:pStyle w:val="ListBullet"/>
+      </w:pPr>
+      <w:r>
+        <w:t>3 Bottom bar fisso con CTA disabilitata finche mancano scelte.</w:t>
+      </w:r>
+    </w:p>
+    <w:p>
+      <w:pPr>
+        <w:pStyle w:val="ListBullet"/>
+      </w:pPr>
+      <w:r>
+        <w:t>4 Accesso area riservata separato dal flusso Cliente.</w:t>
+      </w:r>
+    </w:p>
+    <w:p>
+      <w:r>
+        <w:rPr>
+          <w:b/>
+          <w:sz w:val="20"/>
+        </w:rPr>
+        <w:t>Figura A03 - Cliente - stepper superiore</w:t>
+      </w:r>
+    </w:p>
+    <w:p>
+      <w:r>
+        <w:drawing>
+          <wp:inline xmlns:a="http://schemas.openxmlformats.org/drawingml/2006/main" xmlns:pic="http://schemas.openxmlformats.org/drawingml/2006/picture">
+            <wp:extent cx="5669280" cy="1007872"/>
+            <wp:docPr id="9" name="Picture 9"/>
+            <wp:cNvGraphicFramePr>
+              <a:graphicFrameLocks noChangeAspect="1"/>
+            </wp:cNvGraphicFramePr>
+            <a:graphic>
+              <a:graphicData uri="http://schemas.openxmlformats.org/drawingml/2006/picture">
+                <pic:pic>
+                  <pic:nvPicPr>
+                    <pic:cNvPr id="0" name="fig-03-cliente-stepper-e-stato.png"/>
+                    <pic:cNvPicPr/>
+                  </pic:nvPicPr>
+                  <pic:blipFill>
+                    <a:blip r:embed="rId24"/>
+                    <a:stretch>
+                      <a:fillRect/>
+                    </a:stretch>
+                  </pic:blipFill>
+                  <pic:spPr>
+                    <a:xfrm>
+                      <a:off x="0" y="0"/>
+                      <a:ext cx="5669280" cy="1007872"/>
+                    </a:xfrm>
+                    <a:prstGeom prst="rect"/>
+                  </pic:spPr>
+                </pic:pic>
+              </a:graphicData>
+            </a:graphic>
+          </wp:inline>
+        </w:drawing>
+      </w:r>
+    </w:p>
+    <w:p>
+      <w:pPr>
+        <w:pStyle w:val="ListBullet"/>
+      </w:pPr>
+      <w:r>
+        <w:t>1 Step corrente.</w:t>
+      </w:r>
+    </w:p>
+    <w:p>
+      <w:pPr>
+        <w:pStyle w:val="ListBullet"/>
+      </w:pPr>
+      <w:r>
+        <w:t>2 Step successivi del percorso.</w:t>
+      </w:r>
+    </w:p>
+    <w:p>
+      <w:pPr>
+        <w:pStyle w:val="ListBullet"/>
+      </w:pPr>
+      <w:r>
+        <w:t>3 Navigazione guidata: ogni step abilita azioni coerenti.</w:t>
+      </w:r>
+    </w:p>
+    <w:p>
+      <w:r>
+        <w:rPr>
+          <w:b/>
+          <w:sz w:val="20"/>
+        </w:rPr>
+        <w:t>Figura A04 - Cliente - interessi e temi</w:t>
+      </w:r>
+    </w:p>
+    <w:p>
+      <w:r>
+        <w:drawing>
+          <wp:inline xmlns:a="http://schemas.openxmlformats.org/drawingml/2006/main" xmlns:pic="http://schemas.openxmlformats.org/drawingml/2006/picture">
+            <wp:extent cx="5897880" cy="4095750"/>
+            <wp:docPr id="10" name="Picture 10"/>
+            <wp:cNvGraphicFramePr>
+              <a:graphicFrameLocks noChangeAspect="1"/>
+            </wp:cNvGraphicFramePr>
+            <a:graphic>
+              <a:graphicData uri="http://schemas.openxmlformats.org/drawingml/2006/picture">
+                <pic:pic>
+                  <pic:nvPicPr>
+                    <pic:cNvPr id="0" name="fig-04-cliente-interessi-temi.png"/>
+                    <pic:cNvPicPr/>
+                  </pic:nvPicPr>
+                  <pic:blipFill>
+                    <a:blip r:embed="rId25"/>
+                    <a:stretch>
+                      <a:fillRect/>
+                    </a:stretch>
+                  </pic:blipFill>
+                  <pic:spPr>
+                    <a:xfrm>
+                      <a:off x="0" y="0"/>
+                      <a:ext cx="5897880" cy="4095750"/>
+                    </a:xfrm>
+                    <a:prstGeom prst="rect"/>
+                  </pic:spPr>
+                </pic:pic>
+              </a:graphicData>
+            </a:graphic>
+          </wp:inline>
+        </w:drawing>
+      </w:r>
+    </w:p>
+    <w:p>
+      <w:pPr>
+        <w:pStyle w:val="ListBullet"/>
+      </w:pPr>
+      <w:r>
+        <w:t>1 Card interesse selezionabile.</w:t>
+      </w:r>
+    </w:p>
+    <w:p>
+      <w:pPr>
+        <w:pStyle w:val="ListBullet"/>
+      </w:pPr>
+      <w:r>
+        <w:t>2 Pannello temi collegati.</w:t>
+      </w:r>
+    </w:p>
+    <w:p>
+      <w:pPr>
+        <w:pStyle w:val="ListBullet"/>
+      </w:pPr>
+      <w:r>
+        <w:t>3 Comando per continuare verso consigliati/catalogo.</w:t>
+      </w:r>
+    </w:p>
+    <w:p>
+      <w:r>
+        <w:rPr>
+          <w:b/>
+          <w:sz w:val="20"/>
+        </w:rPr>
+        <w:t>Figura A05 - Cliente - dettaglio temi</w:t>
+      </w:r>
+    </w:p>
+    <w:p>
+      <w:r>
+        <w:drawing>
+          <wp:inline xmlns:a="http://schemas.openxmlformats.org/drawingml/2006/main" xmlns:pic="http://schemas.openxmlformats.org/drawingml/2006/picture">
+            <wp:extent cx="5897880" cy="4557453"/>
+            <wp:docPr id="11" name="Picture 11"/>
+            <wp:cNvGraphicFramePr>
+              <a:graphicFrameLocks noChangeAspect="1"/>
+            </wp:cNvGraphicFramePr>
+            <a:graphic>
+              <a:graphicData uri="http://schemas.openxmlformats.org/drawingml/2006/picture">
+                <pic:pic>
+                  <pic:nvPicPr>
+                    <pic:cNvPr id="0" name="fig-05-cliente-filtri-temi.png"/>
+                    <pic:cNvPicPr/>
+                  </pic:nvPicPr>
+                  <pic:blipFill>
+                    <a:blip r:embed="rId26"/>
+                    <a:stretch>
+                      <a:fillRect/>
+                    </a:stretch>
+                  </pic:blipFill>
+                  <pic:spPr>
+                    <a:xfrm>
+                      <a:off x="0" y="0"/>
+                      <a:ext cx="5897880" cy="4557453"/>
+                    </a:xfrm>
+                    <a:prstGeom prst="rect"/>
+                  </pic:spPr>
+                </pic:pic>
+              </a:graphicData>
+            </a:graphic>
+          </wp:inline>
+        </w:drawing>
+      </w:r>
+    </w:p>
+    <w:p>
+      <w:pPr>
+        <w:pStyle w:val="ListBullet"/>
+      </w:pPr>
+      <w:r>
+        <w:t>1 Lista temi derivati dagli interessi.</w:t>
+      </w:r>
+    </w:p>
+    <w:p>
+      <w:pPr>
+        <w:pStyle w:val="ListBullet"/>
+      </w:pPr>
+      <w:r>
+        <w:t>2 Singolo tema attivabile/rimuovibile.</w:t>
+      </w:r>
+    </w:p>
+    <w:p>
+      <w:pPr>
+        <w:pStyle w:val="ListBullet"/>
+      </w:pPr>
+      <w:r>
+        <w:t>3 Le modifiche aggiornano consigli e catalogo.</w:t>
+      </w:r>
+    </w:p>
+    <w:p/>
+    <w:p>
+      <w:r>
+        <w:rPr>
+          <w:b/>
+          <w:sz w:val="20"/>
+        </w:rPr>
+        <w:t>Figura A06 - Cliente - workshop e preventivo</w:t>
+      </w:r>
+    </w:p>
+    <w:p>
+      <w:r>
+        <w:drawing>
+          <wp:inline xmlns:a="http://schemas.openxmlformats.org/drawingml/2006/main" xmlns:pic="http://schemas.openxmlformats.org/drawingml/2006/picture">
+            <wp:extent cx="5897880" cy="4095750"/>
+            <wp:docPr id="12" name="Picture 12"/>
+            <wp:cNvGraphicFramePr>
+              <a:graphicFrameLocks noChangeAspect="1"/>
+            </wp:cNvGraphicFramePr>
+            <a:graphic>
+              <a:graphicData uri="http://schemas.openxmlformats.org/drawingml/2006/picture">
+                <pic:pic>
+                  <pic:nvPicPr>
+                    <pic:cNvPr id="0" name="fig-06-cliente-workshop-preventivo.png"/>
+                    <pic:cNvPicPr/>
+                  </pic:nvPicPr>
+                  <pic:blipFill>
+                    <a:blip r:embed="rId27"/>
+                    <a:stretch>
+                      <a:fillRect/>
+                    </a:stretch>
+                  </pic:blipFill>
+                  <pic:spPr>
+                    <a:xfrm>
+                      <a:off x="0" y="0"/>
+                      <a:ext cx="5897880" cy="4095750"/>
+                    </a:xfrm>
+                    <a:prstGeom prst="rect"/>
+                  </pic:spPr>
+                </pic:pic>
+              </a:graphicData>
+            </a:graphic>
+          </wp:inline>
+        </w:drawing>
+      </w:r>
+    </w:p>
+    <w:p>
+      <w:pPr>
+        <w:pStyle w:val="ListBullet"/>
+      </w:pPr>
+      <w:r>
+        <w:t>1 Workshop selezionati/percorso.</w:t>
+      </w:r>
+    </w:p>
+    <w:p>
+      <w:pPr>
+        <w:pStyle w:val="ListBullet"/>
+      </w:pPr>
+      <w:r>
+        <w:t>2 Catalogo filtrabile.</w:t>
+      </w:r>
+    </w:p>
+    <w:p>
+      <w:pPr>
+        <w:pStyle w:val="ListBullet"/>
+      </w:pPr>
+      <w:r>
+        <w:t>3 Preventivo aggiornato in tempo reale.</w:t>
+      </w:r>
+    </w:p>
+    <w:p>
+      <w:pPr>
+        <w:pStyle w:val="ListBullet"/>
+      </w:pPr>
+      <w:r>
+        <w:t>4 CTA nel bottom sheet fisso.</w:t>
+      </w:r>
+    </w:p>
+    <w:p>
+      <w:r>
+        <w:rPr>
+          <w:b/>
+          <w:sz w:val="20"/>
+        </w:rPr>
+        <w:t>Figura A07 - Cliente - card workshop</w:t>
+      </w:r>
+    </w:p>
+    <w:p>
+      <w:r>
+        <w:drawing>
+          <wp:inline xmlns:a="http://schemas.openxmlformats.org/drawingml/2006/main" xmlns:pic="http://schemas.openxmlformats.org/drawingml/2006/picture">
+            <wp:extent cx="5897880" cy="4297027"/>
+            <wp:docPr id="13" name="Picture 13"/>
+            <wp:cNvGraphicFramePr>
+              <a:graphicFrameLocks noChangeAspect="1"/>
+            </wp:cNvGraphicFramePr>
+            <a:graphic>
+              <a:graphicData uri="http://schemas.openxmlformats.org/drawingml/2006/picture">
+                <pic:pic>
+                  <pic:nvPicPr>
+                    <pic:cNvPr id="0" name="fig-07-cliente-catalogo-card.png"/>
+                    <pic:cNvPicPr/>
+                  </pic:nvPicPr>
+                  <pic:blipFill>
+                    <a:blip r:embed="rId28"/>
+                    <a:stretch>
+                      <a:fillRect/>
+                    </a:stretch>
+                  </pic:blipFill>
+                  <pic:spPr>
+                    <a:xfrm>
+                      <a:off x="0" y="0"/>
+                      <a:ext cx="5897880" cy="4297027"/>
+                    </a:xfrm>
+                    <a:prstGeom prst="rect"/>
+                  </pic:spPr>
+                </pic:pic>
+              </a:graphicData>
+            </a:graphic>
+          </wp:inline>
+        </w:drawing>
+      </w:r>
+    </w:p>
+    <w:p>
+      <w:pPr>
+        <w:pStyle w:val="ListBullet"/>
+      </w:pPr>
+      <w:r>
+        <w:t>1 Titolo e classificazione del workshop.</w:t>
+      </w:r>
+    </w:p>
+    <w:p>
+      <w:pPr>
+        <w:pStyle w:val="ListBullet"/>
+      </w:pPr>
+      <w:r>
+        <w:t>2 Durata/formato/prezzo esposti nella card.</w:t>
+      </w:r>
+    </w:p>
+    <w:p>
+      <w:pPr>
+        <w:pStyle w:val="ListBullet"/>
+      </w:pPr>
+      <w:r>
+        <w:t>3 Aggiunta o rimozione dal percorso.</w:t>
+      </w:r>
+    </w:p>
+    <w:p>
+      <w:r>
+        <w:rPr>
+          <w:b/>
+          <w:sz w:val="20"/>
+        </w:rPr>
+        <w:t>Figura A08 - Cliente - prezzo e sconti</w:t>
+      </w:r>
+    </w:p>
+    <w:p>
+      <w:r>
+        <w:drawing>
+          <wp:inline xmlns:a="http://schemas.openxmlformats.org/drawingml/2006/main" xmlns:pic="http://schemas.openxmlformats.org/drawingml/2006/picture">
+            <wp:extent cx="5669280" cy="1075208"/>
+            <wp:docPr id="14" name="Picture 14"/>
+            <wp:cNvGraphicFramePr>
+              <a:graphicFrameLocks noChangeAspect="1"/>
+            </wp:cNvGraphicFramePr>
+            <a:graphic>
+              <a:graphicData uri="http://schemas.openxmlformats.org/drawingml/2006/picture">
+                <pic:pic>
+                  <pic:nvPicPr>
+                    <pic:cNvPr id="0" name="fig-08-cliente-prezzo-sconti.png"/>
+                    <pic:cNvPicPr/>
+                  </pic:nvPicPr>
+                  <pic:blipFill>
+                    <a:blip r:embed="rId29"/>
+                    <a:stretch>
+                      <a:fillRect/>
+                    </a:stretch>
+                  </pic:blipFill>
+                  <pic:spPr>
+                    <a:xfrm>
+                      <a:off x="0" y="0"/>
+                      <a:ext cx="5669280" cy="1075208"/>
+                    </a:xfrm>
+                    <a:prstGeom prst="rect"/>
+                  </pic:spPr>
+                </pic:pic>
+              </a:graphicData>
+            </a:graphic>
+          </wp:inline>
+        </w:drawing>
+      </w:r>
+    </w:p>
+    <w:p>
+      <w:pPr>
+        <w:pStyle w:val="ListBullet"/>
+      </w:pPr>
+      <w:r>
+        <w:t>1 Totale preventivo corrente.</w:t>
+      </w:r>
+    </w:p>
+    <w:p>
+      <w:pPr>
+        <w:pStyle w:val="ListBullet"/>
+      </w:pPr>
+      <w:r>
+        <w:t>2 Soglie/sconti o note commerciali.</w:t>
+      </w:r>
+    </w:p>
+    <w:p>
+      <w:pPr>
+        <w:pStyle w:val="ListBullet"/>
+      </w:pPr>
+      <w:r>
+        <w:t>3 Azione primaria sempre raggiungibile nel footer fisso.</w:t>
+      </w:r>
+    </w:p>
+    <w:p>
+      <w:r>
+        <w:rPr>
+          <w:b/>
+          <w:sz w:val="20"/>
+        </w:rPr>
+        <w:t>Figura A09 - Cliente - scelta date</w:t>
+      </w:r>
+    </w:p>
+    <w:p>
+      <w:r>
+        <w:drawing>
+          <wp:inline xmlns:a="http://schemas.openxmlformats.org/drawingml/2006/main" xmlns:pic="http://schemas.openxmlformats.org/drawingml/2006/picture">
+            <wp:extent cx="5897880" cy="4095750"/>
+            <wp:docPr id="15" name="Picture 15"/>
+            <wp:cNvGraphicFramePr>
+              <a:graphicFrameLocks noChangeAspect="1"/>
+            </wp:cNvGraphicFramePr>
+            <a:graphic>
+              <a:graphicData uri="http://schemas.openxmlformats.org/drawingml/2006/picture">
+                <pic:pic>
+                  <pic:nvPicPr>
+                    <pic:cNvPr id="0" name="fig-09-cliente-date-picker.png"/>
+                    <pic:cNvPicPr/>
+                  </pic:nvPicPr>
+                  <pic:blipFill>
+                    <a:blip r:embed="rId30"/>
+                    <a:stretch>
+                      <a:fillRect/>
+                    </a:stretch>
+                  </pic:blipFill>
+                  <pic:spPr>
+                    <a:xfrm>
+                      <a:off x="0" y="0"/>
+                      <a:ext cx="5897880" cy="4095750"/>
+                    </a:xfrm>
+                    <a:prstGeom prst="rect"/>
+                  </pic:spPr>
+                </pic:pic>
+              </a:graphicData>
+            </a:graphic>
+          </wp:inline>
+        </w:drawing>
+      </w:r>
+    </w:p>
+    <w:p>
+      <w:pPr>
+        <w:pStyle w:val="ListBullet"/>
+      </w:pPr>
+      <w:r>
+        <w:t>1 Mese corrente dinamico, non hardcoded.</w:t>
+      </w:r>
+    </w:p>
+    <w:p>
+      <w:pPr>
+        <w:pStyle w:val="ListBullet"/>
+      </w:pPr>
+      <w:r>
+        <w:t>2 Navigazione mese precedente/successivo.</w:t>
+      </w:r>
+    </w:p>
+    <w:p>
+      <w:pPr>
+        <w:pStyle w:val="ListBullet"/>
+      </w:pPr>
+      <w:r>
+        <w:t>3 Griglia date selezionabile.</w:t>
+      </w:r>
+    </w:p>
+    <w:p>
+      <w:pPr>
+        <w:pStyle w:val="ListBullet"/>
+      </w:pPr>
+      <w:r>
+        <w:t>4 Conferma o chiusura della proposta.</w:t>
+      </w:r>
+    </w:p>
+    <w:p>
+      <w:r>
+        <w:rPr>
+          <w:b/>
+          <w:sz w:val="20"/>
+        </w:rPr>
+        <w:t>Figura A10 - Cliente - dettagli calendario</w:t>
+      </w:r>
+    </w:p>
+    <w:p>
+      <w:r>
+        <w:drawing>
+          <wp:inline xmlns:a="http://schemas.openxmlformats.org/drawingml/2006/main" xmlns:pic="http://schemas.openxmlformats.org/drawingml/2006/picture">
+            <wp:extent cx="5897880" cy="6650801"/>
+            <wp:docPr id="16" name="Picture 16"/>
+            <wp:cNvGraphicFramePr>
+              <a:graphicFrameLocks noChangeAspect="1"/>
+            </wp:cNvGraphicFramePr>
+            <a:graphic>
+              <a:graphicData uri="http://schemas.openxmlformats.org/drawingml/2006/picture">
+                <pic:pic>
+                  <pic:nvPicPr>
+                    <pic:cNvPr id="0" name="fig-10-cliente-date-picker-closeup.png"/>
+                    <pic:cNvPicPr/>
+                  </pic:nvPicPr>
+                  <pic:blipFill>
+                    <a:blip r:embed="rId31"/>
+                    <a:stretch>
+                      <a:fillRect/>
+                    </a:stretch>
+                  </pic:blipFill>
+                  <pic:spPr>
+                    <a:xfrm>
+                      <a:off x="0" y="0"/>
+                      <a:ext cx="5897880" cy="6650801"/>
+                    </a:xfrm>
+                    <a:prstGeom prst="rect"/>
+                  </pic:spPr>
+                </pic:pic>
+              </a:graphicData>
+            </a:graphic>
+          </wp:inline>
+        </w:drawing>
+      </w:r>
+    </w:p>
+    <w:p>
+      <w:pPr>
+        <w:pStyle w:val="ListBullet"/>
+      </w:pPr>
+      <w:r>
+        <w:t>1 Comandi mese.</w:t>
+      </w:r>
+    </w:p>
+    <w:p>
+      <w:pPr>
+        <w:pStyle w:val="ListBullet"/>
+      </w:pPr>
+      <w:r>
+        <w:t>2 Comando Adesso: usa la data corrente del browser.</w:t>
+      </w:r>
+    </w:p>
+    <w:p>
+      <w:pPr>
+        <w:pStyle w:val="ListBullet"/>
+      </w:pPr>
+      <w:r>
+        <w:t>3 Giorno selezionato/available.</w:t>
+      </w:r>
+    </w:p>
+    <w:p>
+      <w:pPr>
+        <w:pStyle w:val="ListBullet"/>
+      </w:pPr>
+      <w:r>
+        <w:t>4 Pulsanti di conferma e annullamento.</w:t>
+      </w:r>
+    </w:p>
+    <w:p/>
+    <w:p>
+      <w:r>
+        <w:rPr>
+          <w:b/>
+          <w:sz w:val="20"/>
+        </w:rPr>
+        <w:t>Figura A11 - Bottom action bar / fixed bottom sheet</w:t>
+      </w:r>
+    </w:p>
+    <w:p>
+      <w:r>
+        <w:drawing>
+          <wp:inline xmlns:a="http://schemas.openxmlformats.org/drawingml/2006/main" xmlns:pic="http://schemas.openxmlformats.org/drawingml/2006/picture">
+            <wp:extent cx="5669280" cy="984250"/>
+            <wp:docPr id="17" name="Picture 17"/>
+            <wp:cNvGraphicFramePr>
+              <a:graphicFrameLocks noChangeAspect="1"/>
+            </wp:cNvGraphicFramePr>
+            <a:graphic>
+              <a:graphicData uri="http://schemas.openxmlformats.org/drawingml/2006/picture">
+                <pic:pic>
+                  <pic:nvPicPr>
+                    <pic:cNvPr id="0" name="fig-11-bottom-sheet-fisso.png"/>
+                    <pic:cNvPicPr/>
+                  </pic:nvPicPr>
+                  <pic:blipFill>
+                    <a:blip r:embed="rId32"/>
+                    <a:stretch>
+                      <a:fillRect/>
+                    </a:stretch>
+                  </pic:blipFill>
+                  <pic:spPr>
+                    <a:xfrm>
+                      <a:off x="0" y="0"/>
+                      <a:ext cx="5669280" cy="984250"/>
+                    </a:xfrm>
+                    <a:prstGeom prst="rect"/>
+                  </pic:spPr>
+                </pic:pic>
+              </a:graphicData>
+            </a:graphic>
+          </wp:inline>
+        </w:drawing>
+      </w:r>
+    </w:p>
+    <w:p>
+      <w:pPr>
+        <w:pStyle w:val="ListBullet"/>
+      </w:pPr>
+      <w:r>
+        <w:t>1 Contesto operativo dello step.</w:t>
+      </w:r>
+    </w:p>
+    <w:p>
+      <w:pPr>
+        <w:pStyle w:val="ListBullet"/>
+      </w:pPr>
+      <w:r>
+        <w:t>2 Dettaglio o conteggio selezioni.</w:t>
+      </w:r>
+    </w:p>
+    <w:p>
+      <w:pPr>
+        <w:pStyle w:val="ListBullet"/>
+      </w:pPr>
+      <w:r>
+        <w:t>3 Back/secondaria quando previste.</w:t>
+      </w:r>
+    </w:p>
+    <w:p>
+      <w:pPr>
+        <w:pStyle w:val="ListBullet"/>
+      </w:pPr>
+      <w:r>
+        <w:t>4 CTA primaria; se disabilitata mostra hint sotto.</w:t>
+      </w:r>
+    </w:p>
+    <w:p>
+      <w:r>
+        <w:rPr>
+          <w:b/>
+          <w:sz w:val="20"/>
+        </w:rPr>
+        <w:t>Figura A12 - Bottom sheet disabilitato</w:t>
+      </w:r>
+    </w:p>
+    <w:p>
+      <w:r>
+        <w:drawing>
+          <wp:inline xmlns:a="http://schemas.openxmlformats.org/drawingml/2006/main" xmlns:pic="http://schemas.openxmlformats.org/drawingml/2006/picture">
+            <wp:extent cx="5669280" cy="1543304"/>
+            <wp:docPr id="18" name="Picture 18"/>
+            <wp:cNvGraphicFramePr>
+              <a:graphicFrameLocks noChangeAspect="1"/>
+            </wp:cNvGraphicFramePr>
+            <a:graphic>
+              <a:graphicData uri="http://schemas.openxmlformats.org/drawingml/2006/picture">
+                <pic:pic>
+                  <pic:nvPicPr>
+                    <pic:cNvPr id="0" name="fig-12-bottom-sheet-disabled.png"/>
+                    <pic:cNvPicPr/>
+                  </pic:nvPicPr>
+                  <pic:blipFill>
+                    <a:blip r:embed="rId33"/>
+                    <a:stretch>
+                      <a:fillRect/>
+                    </a:stretch>
+                  </pic:blipFill>
+                  <pic:spPr>
+                    <a:xfrm>
+                      <a:off x="0" y="0"/>
+                      <a:ext cx="5669280" cy="1543304"/>
+                    </a:xfrm>
+                    <a:prstGeom prst="rect"/>
+                  </pic:spPr>
+                </pic:pic>
+              </a:graphicData>
+            </a:graphic>
+          </wp:inline>
+        </w:drawing>
+      </w:r>
+    </w:p>
+    <w:p>
+      <w:pPr>
+        <w:pStyle w:val="ListBullet"/>
+      </w:pPr>
+      <w:r>
+        <w:t>1 Riepilogo stato non pronto.</w:t>
+      </w:r>
+    </w:p>
+    <w:p>
+      <w:pPr>
+        <w:pStyle w:val="ListBullet"/>
+      </w:pPr>
+      <w:r>
+        <w:t>2 Messaggio/hint operativo.</w:t>
+      </w:r>
+    </w:p>
+    <w:p>
+      <w:pPr>
+        <w:pStyle w:val="ListBullet"/>
+      </w:pPr>
+      <w:r>
+        <w:t>3 CTA non cliccabile finche mancano prerequisiti.</w:t>
+      </w:r>
+    </w:p>
+    <w:p/>
+    <w:p>
+      <w:r>
+        <w:rPr>
+          <w:b/>
+          <w:sz w:val="20"/>
+        </w:rPr>
+        <w:t>Figura A13 - FunniFin - coda operativa</w:t>
+      </w:r>
+    </w:p>
+    <w:p>
+      <w:r>
+        <w:drawing>
+          <wp:inline xmlns:a="http://schemas.openxmlformats.org/drawingml/2006/main" xmlns:pic="http://schemas.openxmlformats.org/drawingml/2006/picture">
+            <wp:extent cx="5897880" cy="4914900"/>
+            <wp:docPr id="19" name="Picture 19"/>
+            <wp:cNvGraphicFramePr>
+              <a:graphicFrameLocks noChangeAspect="1"/>
+            </wp:cNvGraphicFramePr>
+            <a:graphic>
+              <a:graphicData uri="http://schemas.openxmlformats.org/drawingml/2006/picture">
+                <pic:pic>
+                  <pic:nvPicPr>
+                    <pic:cNvPr id="0" name="fig-13-funnifin-coda.png"/>
+                    <pic:cNvPicPr/>
+                  </pic:nvPicPr>
+                  <pic:blipFill>
+                    <a:blip r:embed="rId34"/>
+                    <a:stretch>
+                      <a:fillRect/>
+                    </a:stretch>
+                  </pic:blipFill>
+                  <pic:spPr>
+                    <a:xfrm>
+                      <a:off x="0" y="0"/>
+                      <a:ext cx="5897880" cy="4914900"/>
+                    </a:xfrm>
+                    <a:prstGeom prst="rect"/>
+                  </pic:spPr>
+                </pic:pic>
+              </a:graphicData>
+            </a:graphic>
+          </wp:inline>
+        </w:drawing>
+      </w:r>
+    </w:p>
+    <w:p>
+      <w:pPr>
+        <w:pStyle w:val="ListBullet"/>
+      </w:pPr>
+      <w:r>
+        <w:t>1 Ruolo attivo e impersonificazione.</w:t>
+      </w:r>
+    </w:p>
+    <w:p>
+      <w:pPr>
+        <w:pStyle w:val="ListBullet"/>
+      </w:pPr>
+      <w:r>
+        <w:t>2 Moduli sistema/health.</w:t>
+      </w:r>
+    </w:p>
+    <w:p>
+      <w:pPr>
+        <w:pStyle w:val="ListBullet"/>
+      </w:pPr>
+      <w:r>
+        <w:t>3 Filtri coda progetti.</w:t>
+      </w:r>
+    </w:p>
+    <w:p>
+      <w:pPr>
+        <w:pStyle w:val="ListBullet"/>
+      </w:pPr>
+      <w:r>
+        <w:t>4 Azione primaria nel footer.</w:t>
+      </w:r>
+    </w:p>
+    <w:p>
+      <w:r>
+        <w:rPr>
+          <w:b/>
+          <w:sz w:val="20"/>
+        </w:rPr>
+        <w:t>Figura A14 - FunniFin - moduli sistema</w:t>
+      </w:r>
+    </w:p>
+    <w:p>
+      <w:r>
+        <w:drawing>
+          <wp:inline xmlns:a="http://schemas.openxmlformats.org/drawingml/2006/main" xmlns:pic="http://schemas.openxmlformats.org/drawingml/2006/picture">
+            <wp:extent cx="5669280" cy="1441342"/>
+            <wp:docPr id="20" name="Picture 20"/>
+            <wp:cNvGraphicFramePr>
+              <a:graphicFrameLocks noChangeAspect="1"/>
+            </wp:cNvGraphicFramePr>
+            <a:graphic>
+              <a:graphicData uri="http://schemas.openxmlformats.org/drawingml/2006/picture">
+                <pic:pic>
+                  <pic:nvPicPr>
+                    <pic:cNvPr id="0" name="fig-14-funnifin-moduli-sistema.png"/>
+                    <pic:cNvPicPr/>
+                  </pic:nvPicPr>
+                  <pic:blipFill>
+                    <a:blip r:embed="rId35"/>
+                    <a:stretch>
+                      <a:fillRect/>
+                    </a:stretch>
+                  </pic:blipFill>
+                  <pic:spPr>
+                    <a:xfrm>
+                      <a:off x="0" y="0"/>
+                      <a:ext cx="5669280" cy="1441342"/>
+                    </a:xfrm>
+                    <a:prstGeom prst="rect"/>
+                  </pic:spPr>
+                </pic:pic>
+              </a:graphicData>
+            </a:graphic>
+          </wp:inline>
+        </w:drawing>
+      </w:r>
+    </w:p>
+    <w:p>
+      <w:pPr>
+        <w:pStyle w:val="ListBullet"/>
+      </w:pPr>
+      <w:r>
+        <w:t>1 Richieste cliente.</w:t>
+      </w:r>
+    </w:p>
+    <w:p>
+      <w:pPr>
+        <w:pStyle w:val="ListBullet"/>
+      </w:pPr>
+      <w:r>
+        <w:t>2 Catalogo vendibile.</w:t>
+      </w:r>
+    </w:p>
+    <w:p>
+      <w:pPr>
+        <w:pStyle w:val="ListBullet"/>
+      </w:pPr>
+      <w:r>
+        <w:t>3 Regole prezzo.</w:t>
+      </w:r>
+    </w:p>
+    <w:p>
+      <w:pPr>
+        <w:pStyle w:val="ListBullet"/>
+      </w:pPr>
+      <w:r>
+        <w:t>4 Google backend e utenti/mail.</w:t>
+      </w:r>
+    </w:p>
+    <w:p>
+      <w:r>
+        <w:rPr>
+          <w:b/>
+          <w:sz w:val="20"/>
+        </w:rPr>
+        <w:t>Figura A15 - FunniFin - coda progetti</w:t>
+      </w:r>
+    </w:p>
+    <w:p>
+      <w:r>
+        <w:drawing>
+          <wp:inline xmlns:a="http://schemas.openxmlformats.org/drawingml/2006/main" xmlns:pic="http://schemas.openxmlformats.org/drawingml/2006/picture">
+            <wp:extent cx="5897880" cy="1769364"/>
+            <wp:docPr id="21" name="Picture 21"/>
+            <wp:cNvGraphicFramePr>
+              <a:graphicFrameLocks noChangeAspect="1"/>
+            </wp:cNvGraphicFramePr>
+            <a:graphic>
+              <a:graphicData uri="http://schemas.openxmlformats.org/drawingml/2006/picture">
+                <pic:pic>
+                  <pic:nvPicPr>
+                    <pic:cNvPr id="0" name="fig-15-funnifin-coda-progetti.png"/>
+                    <pic:cNvPicPr/>
+                  </pic:nvPicPr>
+                  <pic:blipFill>
+                    <a:blip r:embed="rId36"/>
+                    <a:stretch>
+                      <a:fillRect/>
+                    </a:stretch>
+                  </pic:blipFill>
+                  <pic:spPr>
+                    <a:xfrm>
+                      <a:off x="0" y="0"/>
+                      <a:ext cx="5897880" cy="1769364"/>
+                    </a:xfrm>
+                    <a:prstGeom prst="rect"/>
+                  </pic:spPr>
+                </pic:pic>
+              </a:graphicData>
+            </a:graphic>
+          </wp:inline>
+        </w:drawing>
+      </w:r>
+    </w:p>
+    <w:p>
+      <w:pPr>
+        <w:pStyle w:val="ListBullet"/>
+      </w:pPr>
+      <w:r>
+        <w:t>1 Card progetto con stato e totale.</w:t>
+      </w:r>
+    </w:p>
+    <w:p>
+      <w:pPr>
+        <w:pStyle w:val="ListBullet"/>
+      </w:pPr>
+      <w:r>
+        <w:t>2 Ricerca per azienda/referente.</w:t>
+      </w:r>
+    </w:p>
+    <w:p>
+      <w:pPr>
+        <w:pStyle w:val="ListBullet"/>
+      </w:pPr>
+      <w:r>
+        <w:t>3 Filtri Oggi/Da fissare/Produzione/Chiusi.</w:t>
+      </w:r>
+    </w:p>
+    <w:p/>
+    <w:p>
+      <w:r>
+        <w:rPr>
+          <w:b/>
+          <w:sz w:val="20"/>
+        </w:rPr>
+        <w:t>Figura A16 - Centro notifiche</w:t>
+      </w:r>
+    </w:p>
+    <w:p>
+      <w:r>
+        <w:drawing>
+          <wp:inline xmlns:a="http://schemas.openxmlformats.org/drawingml/2006/main" xmlns:pic="http://schemas.openxmlformats.org/drawingml/2006/picture">
+            <wp:extent cx="5897880" cy="4914900"/>
+            <wp:docPr id="22" name="Picture 22"/>
+            <wp:cNvGraphicFramePr>
+              <a:graphicFrameLocks noChangeAspect="1"/>
+            </wp:cNvGraphicFramePr>
+            <a:graphic>
+              <a:graphicData uri="http://schemas.openxmlformats.org/drawingml/2006/picture">
+                <pic:pic>
+                  <pic:nvPicPr>
+                    <pic:cNvPr id="0" name="fig-16-centro-notifiche.png"/>
+                    <pic:cNvPicPr/>
+                  </pic:nvPicPr>
+                  <pic:blipFill>
+                    <a:blip r:embed="rId37"/>
+                    <a:stretch>
+                      <a:fillRect/>
+                    </a:stretch>
+                  </pic:blipFill>
+                  <pic:spPr>
+                    <a:xfrm>
+                      <a:off x="0" y="0"/>
+                      <a:ext cx="5897880" cy="4914900"/>
+                    </a:xfrm>
+                    <a:prstGeom prst="rect"/>
+                  </pic:spPr>
+                </pic:pic>
+              </a:graphicData>
+            </a:graphic>
+          </wp:inline>
+        </w:drawing>
+      </w:r>
+    </w:p>
+    <w:p>
+      <w:pPr>
+        <w:pStyle w:val="ListBullet"/>
+      </w:pPr>
+      <w:r>
+        <w:t>1 Bell/badge ruolo riservato.</w:t>
+      </w:r>
+    </w:p>
+    <w:p>
+      <w:pPr>
+        <w:pStyle w:val="ListBullet"/>
+      </w:pPr>
+      <w:r>
+        <w:t>2 Tab Da fare, Recenti, Critiche, Chiuse.</w:t>
+      </w:r>
+    </w:p>
+    <w:p>
+      <w:pPr>
+        <w:pStyle w:val="ListBullet"/>
+      </w:pPr>
+      <w:r>
+        <w:t>3 Filtri per priorita/categoria.</w:t>
+      </w:r>
+    </w:p>
+    <w:p>
+      <w:pPr>
+        <w:pStyle w:val="ListBullet"/>
+      </w:pPr>
+      <w:r>
+        <w:t>4 Azioni: apri progetto/verifica/archivia.</w:t>
+      </w:r>
+    </w:p>
+    <w:p>
+      <w:r>
+        <w:rPr>
+          <w:b/>
+          <w:sz w:val="20"/>
+        </w:rPr>
+        <w:t>Figura A17 - Notifiche - tab e filtri</w:t>
+      </w:r>
+    </w:p>
+    <w:p>
+      <w:r>
+        <w:drawing>
+          <wp:inline xmlns:a="http://schemas.openxmlformats.org/drawingml/2006/main" xmlns:pic="http://schemas.openxmlformats.org/drawingml/2006/picture">
+            <wp:extent cx="5669280" cy="1546167"/>
+            <wp:docPr id="23" name="Picture 23"/>
+            <wp:cNvGraphicFramePr>
+              <a:graphicFrameLocks noChangeAspect="1"/>
+            </wp:cNvGraphicFramePr>
+            <a:graphic>
+              <a:graphicData uri="http://schemas.openxmlformats.org/drawingml/2006/picture">
+                <pic:pic>
+                  <pic:nvPicPr>
+                    <pic:cNvPr id="0" name="fig-17-notifiche-tabs-filtri.png"/>
+                    <pic:cNvPicPr/>
+                  </pic:nvPicPr>
+                  <pic:blipFill>
+                    <a:blip r:embed="rId38"/>
+                    <a:stretch>
+                      <a:fillRect/>
+                    </a:stretch>
+                  </pic:blipFill>
+                  <pic:spPr>
+                    <a:xfrm>
+                      <a:off x="0" y="0"/>
+                      <a:ext cx="5669280" cy="1546167"/>
+                    </a:xfrm>
+                    <a:prstGeom prst="rect"/>
+                  </pic:spPr>
+                </pic:pic>
+              </a:graphicData>
+            </a:graphic>
+          </wp:inline>
+        </w:drawing>
+      </w:r>
+    </w:p>
+    <w:p>
+      <w:pPr>
+        <w:pStyle w:val="ListBullet"/>
+      </w:pPr>
+      <w:r>
+        <w:t>1 Tab con conteggi per stato.</w:t>
+      </w:r>
+    </w:p>
+    <w:p>
+      <w:pPr>
+        <w:pStyle w:val="ListBullet"/>
+      </w:pPr>
+      <w:r>
+        <w:t>2 Chip filtro Tutte/Critiche/Task/Mail/Sistema.</w:t>
+      </w:r>
+    </w:p>
+    <w:p>
+      <w:pPr>
+        <w:pStyle w:val="ListBullet"/>
+      </w:pPr>
+      <w:r>
+        <w:t>3 La lista cambia senza uscire dal pannello.</w:t>
+      </w:r>
+    </w:p>
+    <w:p>
+      <w:r>
+        <w:rPr>
+          <w:b/>
+          <w:sz w:val="20"/>
+        </w:rPr>
+        <w:t>Figura A18 - Notifiche - singola notifica</w:t>
+      </w:r>
+    </w:p>
+    <w:p>
+      <w:r>
+        <w:drawing>
+          <wp:inline xmlns:a="http://schemas.openxmlformats.org/drawingml/2006/main" xmlns:pic="http://schemas.openxmlformats.org/drawingml/2006/picture">
+            <wp:extent cx="5669280" cy="4409440"/>
+            <wp:docPr id="24" name="Picture 24"/>
+            <wp:cNvGraphicFramePr>
+              <a:graphicFrameLocks noChangeAspect="1"/>
+            </wp:cNvGraphicFramePr>
+            <a:graphic>
+              <a:graphicData uri="http://schemas.openxmlformats.org/drawingml/2006/picture">
+                <pic:pic>
+                  <pic:nvPicPr>
+                    <pic:cNvPr id="0" name="fig-18-notifiche-azioni.png"/>
+                    <pic:cNvPicPr/>
+                  </pic:nvPicPr>
+                  <pic:blipFill>
+                    <a:blip r:embed="rId39"/>
+                    <a:stretch>
+                      <a:fillRect/>
+                    </a:stretch>
+                  </pic:blipFill>
+                  <pic:spPr>
+                    <a:xfrm>
+                      <a:off x="0" y="0"/>
+                      <a:ext cx="5669280" cy="4409440"/>
+                    </a:xfrm>
+                    <a:prstGeom prst="rect"/>
+                  </pic:spPr>
+                </pic:pic>
+              </a:graphicData>
+            </a:graphic>
+          </wp:inline>
+        </w:drawing>
+      </w:r>
+    </w:p>
+    <w:p>
+      <w:pPr>
+        <w:pStyle w:val="ListBullet"/>
+      </w:pPr>
+      <w:r>
+        <w:t>1 Priorita e categoria visiva.</w:t>
+      </w:r>
+    </w:p>
+    <w:p>
+      <w:pPr>
+        <w:pStyle w:val="ListBullet"/>
+      </w:pPr>
+      <w:r>
+        <w:t>2 Titolo/corpo della notifica.</w:t>
+      </w:r>
+    </w:p>
+    <w:p>
+      <w:pPr>
+        <w:pStyle w:val="ListBullet"/>
+      </w:pPr>
+      <w:r>
+        <w:t>3 Azione contestuale con routing.</w:t>
+      </w:r>
+    </w:p>
+    <w:p>
+      <w:pPr>
+        <w:pStyle w:val="ListBullet"/>
+      </w:pPr>
+      <w:r>
+        <w:t>4 Archivia/Riapri senza cancellare storico.</w:t>
+      </w:r>
+    </w:p>
+    <w:p/>
+    <w:p>
+      <w:r>
+        <w:rPr>
+          <w:b/>
+          <w:sz w:val="20"/>
+        </w:rPr>
+        <w:t>Figura A19 - Google backend</w:t>
+      </w:r>
+    </w:p>
+    <w:p>
+      <w:r>
+        <w:drawing>
+          <wp:inline xmlns:a="http://schemas.openxmlformats.org/drawingml/2006/main" xmlns:pic="http://schemas.openxmlformats.org/drawingml/2006/picture">
+            <wp:extent cx="5897880" cy="4914900"/>
+            <wp:docPr id="25" name="Picture 25"/>
+            <wp:cNvGraphicFramePr>
+              <a:graphicFrameLocks noChangeAspect="1"/>
+            </wp:cNvGraphicFramePr>
+            <a:graphic>
+              <a:graphicData uri="http://schemas.openxmlformats.org/drawingml/2006/picture">
+                <pic:pic>
+                  <pic:nvPicPr>
+                    <pic:cNvPr id="0" name="fig-19-google-backend.png"/>
+                    <pic:cNvPicPr/>
+                  </pic:nvPicPr>
+                  <pic:blipFill>
+                    <a:blip r:embed="rId40"/>
+                    <a:stretch>
+                      <a:fillRect/>
+                    </a:stretch>
+                  </pic:blipFill>
+                  <pic:spPr>
+                    <a:xfrm>
+                      <a:off x="0" y="0"/>
+                      <a:ext cx="5897880" cy="4914900"/>
+                    </a:xfrm>
+                    <a:prstGeom prst="rect"/>
+                  </pic:spPr>
+                </pic:pic>
+              </a:graphicData>
+            </a:graphic>
+          </wp:inline>
+        </w:drawing>
+      </w:r>
+    </w:p>
+    <w:p>
+      <w:pPr>
+        <w:pStyle w:val="ListBullet"/>
+      </w:pPr>
+      <w:r>
+        <w:t>1 Stato Google Sheets.</w:t>
+      </w:r>
+    </w:p>
+    <w:p>
+      <w:pPr>
+        <w:pStyle w:val="ListBullet"/>
+      </w:pPr>
+      <w:r>
+        <w:t>2 Stato Drive/materiali.</w:t>
+      </w:r>
+    </w:p>
+    <w:p>
+      <w:pPr>
+        <w:pStyle w:val="ListBullet"/>
+      </w:pPr>
+      <w:r>
+        <w:t>3 Calendar/Meet.</w:t>
+      </w:r>
+    </w:p>
+    <w:p>
+      <w:pPr>
+        <w:pStyle w:val="ListBullet"/>
+      </w:pPr>
+      <w:r>
+        <w:t>4 MailApp, quota e destinatari.</w:t>
+      </w:r>
+    </w:p>
+    <w:p>
+      <w:r>
+        <w:rPr>
+          <w:b/>
+          <w:sz w:val="20"/>
+        </w:rPr>
+        <w:t>Figura A20 - Mail backend</w:t>
+      </w:r>
+    </w:p>
+    <w:p>
+      <w:r>
+        <w:drawing>
+          <wp:inline xmlns:a="http://schemas.openxmlformats.org/drawingml/2006/main" xmlns:pic="http://schemas.openxmlformats.org/drawingml/2006/picture">
+            <wp:extent cx="5897880" cy="3724977"/>
+            <wp:docPr id="26" name="Picture 26"/>
+            <wp:cNvGraphicFramePr>
+              <a:graphicFrameLocks noChangeAspect="1"/>
+            </wp:cNvGraphicFramePr>
+            <a:graphic>
+              <a:graphicData uri="http://schemas.openxmlformats.org/drawingml/2006/picture">
+                <pic:pic>
+                  <pic:nvPicPr>
+                    <pic:cNvPr id="0" name="fig-20-mail-backend-closeup.png"/>
+                    <pic:cNvPicPr/>
+                  </pic:nvPicPr>
+                  <pic:blipFill>
+                    <a:blip r:embed="rId41"/>
+                    <a:stretch>
+                      <a:fillRect/>
+                    </a:stretch>
+                  </pic:blipFill>
+                  <pic:spPr>
+                    <a:xfrm>
+                      <a:off x="0" y="0"/>
+                      <a:ext cx="5897880" cy="3724977"/>
+                    </a:xfrm>
+                    <a:prstGeom prst="rect"/>
+                  </pic:spPr>
+                </pic:pic>
+              </a:graphicData>
+            </a:graphic>
+          </wp:inline>
+        </w:drawing>
+      </w:r>
+    </w:p>
+    <w:p>
+      <w:pPr>
+        <w:pStyle w:val="ListBullet"/>
+      </w:pPr>
+      <w:r>
+        <w:t>1 Configurazione MailApp e quota.</w:t>
+      </w:r>
+    </w:p>
+    <w:p>
+      <w:pPr>
+        <w:pStyle w:val="ListBullet"/>
+      </w:pPr>
+      <w:r>
+        <w:t>2 Errori o stato invio.</w:t>
+      </w:r>
+    </w:p>
+    <w:p>
+      <w:pPr>
+        <w:pStyle w:val="ListBullet"/>
+      </w:pPr>
+      <w:r>
+        <w:t>3 Link/verifica impostazioni Google.</w:t>
+      </w:r>
+    </w:p>
+    <w:p/>
+    <w:p>
+      <w:r>
+        <w:rPr>
+          <w:b/>
+          <w:sz w:val="20"/>
+        </w:rPr>
+        <w:t>Figura A21 - Esperto - dashboard</w:t>
+      </w:r>
+    </w:p>
+    <w:p>
+      <w:r>
+        <w:drawing>
+          <wp:inline xmlns:a="http://schemas.openxmlformats.org/drawingml/2006/main" xmlns:pic="http://schemas.openxmlformats.org/drawingml/2006/picture">
+            <wp:extent cx="5897880" cy="4095750"/>
+            <wp:docPr id="27" name="Picture 27"/>
+            <wp:cNvGraphicFramePr>
+              <a:graphicFrameLocks noChangeAspect="1"/>
+            </wp:cNvGraphicFramePr>
+            <a:graphic>
+              <a:graphicData uri="http://schemas.openxmlformats.org/drawingml/2006/picture">
+                <pic:pic>
+                  <pic:nvPicPr>
+                    <pic:cNvPr id="0" name="fig-21-esperto-dashboard.png"/>
+                    <pic:cNvPicPr/>
+                  </pic:nvPicPr>
+                  <pic:blipFill>
+                    <a:blip r:embed="rId42"/>
+                    <a:stretch>
+                      <a:fillRect/>
+                    </a:stretch>
+                  </pic:blipFill>
+                  <pic:spPr>
+                    <a:xfrm>
+                      <a:off x="0" y="0"/>
+                      <a:ext cx="5897880" cy="4095750"/>
+                    </a:xfrm>
+                    <a:prstGeom prst="rect"/>
+                  </pic:spPr>
+                </pic:pic>
+              </a:graphicData>
+            </a:graphic>
+          </wp:inline>
+        </w:drawing>
+      </w:r>
+    </w:p>
+    <w:p>
+      <w:pPr>
+        <w:pStyle w:val="ListBullet"/>
+      </w:pPr>
+      <w:r>
+        <w:t>1 Ruolo Esperto attivo.</w:t>
+      </w:r>
+    </w:p>
+    <w:p>
+      <w:pPr>
+        <w:pStyle w:val="ListBullet"/>
+      </w:pPr>
+      <w:r>
+        <w:t>2 Opportunita/candidature.</w:t>
+      </w:r>
+    </w:p>
+    <w:p>
+      <w:pPr>
+        <w:pStyle w:val="ListBullet"/>
+      </w:pPr>
+      <w:r>
+        <w:t>3 Incarichi o deck da gestire.</w:t>
+      </w:r>
+    </w:p>
+    <w:p>
+      <w:pPr>
+        <w:pStyle w:val="ListBullet"/>
+      </w:pPr>
+      <w:r>
+        <w:t>4 Bottom bar con azione primaria.</w:t>
+      </w:r>
+    </w:p>
+    <w:p>
+      <w:r>
+        <w:rPr>
+          <w:b/>
+          <w:sz w:val="20"/>
+        </w:rPr>
+        <w:t>Figura A22 - Esperto - candidatura</w:t>
+      </w:r>
+    </w:p>
+    <w:p>
+      <w:r>
+        <w:drawing>
+          <wp:inline xmlns:a="http://schemas.openxmlformats.org/drawingml/2006/main" xmlns:pic="http://schemas.openxmlformats.org/drawingml/2006/picture">
+            <wp:extent cx="5897880" cy="2629175"/>
+            <wp:docPr id="28" name="Picture 28"/>
+            <wp:cNvGraphicFramePr>
+              <a:graphicFrameLocks noChangeAspect="1"/>
+            </wp:cNvGraphicFramePr>
+            <a:graphic>
+              <a:graphicData uri="http://schemas.openxmlformats.org/drawingml/2006/picture">
+                <pic:pic>
+                  <pic:nvPicPr>
+                    <pic:cNvPr id="0" name="fig-22-esperto-candidature-closeup.png"/>
+                    <pic:cNvPicPr/>
+                  </pic:nvPicPr>
+                  <pic:blipFill>
+                    <a:blip r:embed="rId43"/>
+                    <a:stretch>
+                      <a:fillRect/>
+                    </a:stretch>
+                  </pic:blipFill>
+                  <pic:spPr>
+                    <a:xfrm>
+                      <a:off x="0" y="0"/>
+                      <a:ext cx="5897880" cy="2629175"/>
+                    </a:xfrm>
+                    <a:prstGeom prst="rect"/>
+                  </pic:spPr>
+                </pic:pic>
+              </a:graphicData>
+            </a:graphic>
+          </wp:inline>
+        </w:drawing>
+      </w:r>
+    </w:p>
+    <w:p>
+      <w:pPr>
+        <w:pStyle w:val="ListBullet"/>
+      </w:pPr>
+      <w:r>
+        <w:t>1 Workshop disponibile o assegnato.</w:t>
+      </w:r>
+    </w:p>
+    <w:p>
+      <w:pPr>
+        <w:pStyle w:val="ListBullet"/>
+      </w:pPr>
+      <w:r>
+        <w:t>2 Dettagli data/formato/materiali.</w:t>
+      </w:r>
+    </w:p>
+    <w:p>
+      <w:pPr>
+        <w:pStyle w:val="ListBullet"/>
+      </w:pPr>
+      <w:r>
+        <w:t>3 Invio candidatura o upload deck.</w:t>
+      </w:r>
+    </w:p>
+    <w:p/>
+    <w:p>
+      <w:r>
+        <w:rPr>
+          <w:b/>
+          <w:sz w:val="20"/>
+        </w:rPr>
+        <w:t>Figura A23 - Brand - revisione materiali</w:t>
+      </w:r>
+    </w:p>
+    <w:p>
+      <w:r>
+        <w:drawing>
+          <wp:inline xmlns:a="http://schemas.openxmlformats.org/drawingml/2006/main" xmlns:pic="http://schemas.openxmlformats.org/drawingml/2006/picture">
+            <wp:extent cx="5897880" cy="6935906"/>
+            <wp:docPr id="29" name="Picture 29"/>
+            <wp:cNvGraphicFramePr>
+              <a:graphicFrameLocks noChangeAspect="1"/>
+            </wp:cNvGraphicFramePr>
+            <a:graphic>
+              <a:graphicData uri="http://schemas.openxmlformats.org/drawingml/2006/picture">
+                <pic:pic>
+                  <pic:nvPicPr>
+                    <pic:cNvPr id="0" name="fig-23-brand-dashboard.png"/>
+                    <pic:cNvPicPr/>
+                  </pic:nvPicPr>
+                  <pic:blipFill>
+                    <a:blip r:embed="rId44"/>
+                    <a:stretch>
+                      <a:fillRect/>
+                    </a:stretch>
+                  </pic:blipFill>
+                  <pic:spPr>
+                    <a:xfrm>
+                      <a:off x="0" y="0"/>
+                      <a:ext cx="5897880" cy="6935906"/>
+                    </a:xfrm>
+                    <a:prstGeom prst="rect"/>
+                  </pic:spPr>
+                </pic:pic>
+              </a:graphicData>
+            </a:graphic>
+          </wp:inline>
+        </w:drawing>
+      </w:r>
+    </w:p>
+    <w:p>
+      <w:pPr>
+        <w:pStyle w:val="ListBullet"/>
+      </w:pPr>
+      <w:r>
+        <w:t>1 Ruolo Brand attivo.</w:t>
+      </w:r>
+    </w:p>
+    <w:p>
+      <w:pPr>
+        <w:pStyle w:val="ListBullet"/>
+      </w:pPr>
+      <w:r>
+        <w:t>2 Coda progetti in revisione.</w:t>
+      </w:r>
+    </w:p>
+    <w:p>
+      <w:pPr>
+        <w:pStyle w:val="ListBullet"/>
+      </w:pPr>
+      <w:r>
+        <w:t>3 Deck/versioni e stato review.</w:t>
+      </w:r>
+    </w:p>
+    <w:p>
+      <w:pPr>
+        <w:pStyle w:val="ListBullet"/>
+      </w:pPr>
+      <w:r>
+        <w:t>4 Bottom bar e azione finale.</w:t>
+      </w:r>
+    </w:p>
+    <w:p>
+      <w:r>
+        <w:rPr>
+          <w:b/>
+          <w:sz w:val="20"/>
+        </w:rPr>
+        <w:t>Figura A24 - Brand - azioni deck</w:t>
+      </w:r>
+    </w:p>
+    <w:p>
+      <w:r>
+        <w:drawing>
+          <wp:inline xmlns:a="http://schemas.openxmlformats.org/drawingml/2006/main" xmlns:pic="http://schemas.openxmlformats.org/drawingml/2006/picture">
+            <wp:extent cx="5897880" cy="2703195"/>
+            <wp:docPr id="30" name="Picture 30"/>
+            <wp:cNvGraphicFramePr>
+              <a:graphicFrameLocks noChangeAspect="1"/>
+            </wp:cNvGraphicFramePr>
+            <a:graphic>
+              <a:graphicData uri="http://schemas.openxmlformats.org/drawingml/2006/picture">
+                <pic:pic>
+                  <pic:nvPicPr>
+                    <pic:cNvPr id="0" name="fig-24-brand-azioni-deck.png"/>
+                    <pic:cNvPicPr/>
+                  </pic:nvPicPr>
+                  <pic:blipFill>
+                    <a:blip r:embed="rId45"/>
+                    <a:stretch>
+                      <a:fillRect/>
+                    </a:stretch>
+                  </pic:blipFill>
+                  <pic:spPr>
+                    <a:xfrm>
+                      <a:off x="0" y="0"/>
+                      <a:ext cx="5897880" cy="2703195"/>
+                    </a:xfrm>
+                    <a:prstGeom prst="rect"/>
+                  </pic:spPr>
+                </pic:pic>
+              </a:graphicData>
+            </a:graphic>
+          </wp:inline>
+        </w:drawing>
+      </w:r>
+    </w:p>
+    <w:p>
+      <w:pPr>
+        <w:pStyle w:val="ListBullet"/>
+      </w:pPr>
+      <w:r>
+        <w:t>1 Tab Revisioni/Da correggere/Approvate/Storico.</w:t>
+      </w:r>
+    </w:p>
+    <w:p>
+      <w:pPr>
+        <w:pStyle w:val="ListBullet"/>
+      </w:pPr>
+      <w:r>
+        <w:t>2 Deck selezionato.</w:t>
+      </w:r>
+    </w:p>
+    <w:p>
+      <w:pPr>
+        <w:pStyle w:val="ListBullet"/>
+      </w:pPr>
+      <w:r>
+        <w:t>3 Approva o richiedi modifiche.</w:t>
+      </w:r>
+    </w:p>
+    <w:p>
+      <w:pPr>
+        <w:pStyle w:val="ListBullet"/>
+      </w:pPr>
+      <w:r>
+        <w:t>4 Abilita deck per Calendar quando definitivo.</w:t>
+      </w:r>
+    </w:p>
+    <w:p/>
+    <w:p>
+      <w:r>
+        <w:rPr>
+          <w:b/>
+          <w:sz w:val="20"/>
+        </w:rPr>
+        <w:t>Figura A25 - Email richiesta cliente</w:t>
+      </w:r>
+    </w:p>
+    <w:p>
+      <w:r>
+        <w:drawing>
+          <wp:inline xmlns:a="http://schemas.openxmlformats.org/drawingml/2006/main" xmlns:pic="http://schemas.openxmlformats.org/drawingml/2006/picture">
+            <wp:extent cx="5897880" cy="3358515"/>
+            <wp:docPr id="31" name="Picture 31"/>
+            <wp:cNvGraphicFramePr>
+              <a:graphicFrameLocks noChangeAspect="1"/>
+            </wp:cNvGraphicFramePr>
+            <a:graphic>
+              <a:graphicData uri="http://schemas.openxmlformats.org/drawingml/2006/picture">
+                <pic:pic>
+                  <pic:nvPicPr>
+                    <pic:cNvPr id="0" name="fig-25-email-richiesta-cliente.png"/>
+                    <pic:cNvPicPr/>
+                  </pic:nvPicPr>
+                  <pic:blipFill>
+                    <a:blip r:embed="rId46"/>
+                    <a:stretch>
+                      <a:fillRect/>
+                    </a:stretch>
+                  </pic:blipFill>
+                  <pic:spPr>
+                    <a:xfrm>
+                      <a:off x="0" y="0"/>
+                      <a:ext cx="5897880" cy="3358515"/>
+                    </a:xfrm>
+                    <a:prstGeom prst="rect"/>
+                  </pic:spPr>
+                </pic:pic>
+              </a:graphicData>
+            </a:graphic>
+          </wp:inline>
+        </w:drawing>
+      </w:r>
+    </w:p>
+    <w:p>
+      <w:pPr>
+        <w:pStyle w:val="ListBullet"/>
+      </w:pPr>
+      <w:r>
+        <w:t>1 Invio Cliente.</w:t>
+      </w:r>
+    </w:p>
+    <w:p>
+      <w:pPr>
+        <w:pStyle w:val="ListBullet"/>
+      </w:pPr>
+      <w:r>
+        <w:t>2 Apps Script action sendWorkshopRequestEmail.</w:t>
+      </w:r>
+    </w:p>
+    <w:p>
+      <w:pPr>
+        <w:pStyle w:val="ListBullet"/>
+      </w:pPr>
+      <w:r>
+        <w:t>3 Destinatari cliente + FunniFin CC.</w:t>
+      </w:r>
+    </w:p>
+    <w:p>
+      <w:pPr>
+        <w:pStyle w:val="ListBullet"/>
+      </w:pPr>
+      <w:r>
+        <w:t>4 Fallback demo/opaque documentato.</w:t>
+      </w:r>
+    </w:p>
+    <w:p>
+      <w:pPr>
+        <w:pStyle w:val="ListBullet"/>
+      </w:pPr>
+      <w:r>
+        <w:t>5 Presa in carico FunniFin.</w:t>
+      </w:r>
+    </w:p>
+    <w:p>
+      <w:r>
+        <w:rPr>
+          <w:b/>
+          <w:sz w:val="20"/>
+        </w:rPr>
+        <w:t>Figura A26 - Email workflow</w:t>
+      </w:r>
+    </w:p>
+    <w:p>
+      <w:r>
+        <w:drawing>
+          <wp:inline xmlns:a="http://schemas.openxmlformats.org/drawingml/2006/main" xmlns:pic="http://schemas.openxmlformats.org/drawingml/2006/picture">
+            <wp:extent cx="5897880" cy="3358515"/>
+            <wp:docPr id="32" name="Picture 32"/>
+            <wp:cNvGraphicFramePr>
+              <a:graphicFrameLocks noChangeAspect="1"/>
+            </wp:cNvGraphicFramePr>
+            <a:graphic>
+              <a:graphicData uri="http://schemas.openxmlformats.org/drawingml/2006/picture">
+                <pic:pic>
+                  <pic:nvPicPr>
+                    <pic:cNvPr id="0" name="fig-26-email-workflow.png"/>
+                    <pic:cNvPicPr/>
+                  </pic:nvPicPr>
+                  <pic:blipFill>
+                    <a:blip r:embed="rId47"/>
+                    <a:stretch>
+                      <a:fillRect/>
+                    </a:stretch>
+                  </pic:blipFill>
+                  <pic:spPr>
+                    <a:xfrm>
+                      <a:off x="0" y="0"/>
+                      <a:ext cx="5897880" cy="3358515"/>
+                    </a:xfrm>
+                    <a:prstGeom prst="rect"/>
+                  </pic:spPr>
+                </pic:pic>
+              </a:graphicData>
+            </a:graphic>
+          </wp:inline>
+        </w:drawing>
+      </w:r>
+    </w:p>
+    <w:p>
+      <w:pPr>
+        <w:pStyle w:val="ListBullet"/>
+      </w:pPr>
+      <w:r>
+        <w:t>1 Modale operativa FunniFin.</w:t>
+      </w:r>
+    </w:p>
+    <w:p>
+      <w:pPr>
+        <w:pStyle w:val="ListBullet"/>
+      </w:pPr>
+      <w:r>
+        <w:t>2 Toggle notifica e destinatari.</w:t>
+      </w:r>
+    </w:p>
+    <w:p>
+      <w:pPr>
+        <w:pStyle w:val="ListBullet"/>
+      </w:pPr>
+      <w:r>
+        <w:t>3 sendWorkflowNotification.</w:t>
+      </w:r>
+    </w:p>
+    <w:p>
+      <w:pPr>
+        <w:pStyle w:val="ListBullet"/>
+      </w:pPr>
+      <w:r>
+        <w:t>4 Invio/fallback.</w:t>
+      </w:r>
+    </w:p>
+    <w:p>
+      <w:pPr>
+        <w:pStyle w:val="ListBullet"/>
+      </w:pPr>
+      <w:r>
+        <w:t>5 Notifica persistente per ruoli coinvolti.</w:t>
+      </w:r>
+    </w:p>
+    <w:p>
+      <w:r>
+        <w:rPr>
+          <w:b/>
+          <w:sz w:val="20"/>
+        </w:rPr>
+        <w:t>Figura A27 - Matrice notifiche</w:t>
+      </w:r>
+    </w:p>
+    <w:p>
+      <w:r>
+        <w:drawing>
+          <wp:inline xmlns:a="http://schemas.openxmlformats.org/drawingml/2006/main" xmlns:pic="http://schemas.openxmlformats.org/drawingml/2006/picture">
+            <wp:extent cx="5897880" cy="3358515"/>
+            <wp:docPr id="33" name="Picture 33"/>
+            <wp:cNvGraphicFramePr>
+              <a:graphicFrameLocks noChangeAspect="1"/>
+            </wp:cNvGraphicFramePr>
+            <a:graphic>
+              <a:graphicData uri="http://schemas.openxmlformats.org/drawingml/2006/picture">
+                <pic:pic>
+                  <pic:nvPicPr>
+                    <pic:cNvPr id="0" name="fig-27-notifiche-matrice.png"/>
+                    <pic:cNvPicPr/>
+                  </pic:nvPicPr>
+                  <pic:blipFill>
+                    <a:blip r:embed="rId48"/>
+                    <a:stretch>
+                      <a:fillRect/>
+                    </a:stretch>
+                  </pic:blipFill>
+                  <pic:spPr>
+                    <a:xfrm>
+                      <a:off x="0" y="0"/>
+                      <a:ext cx="5897880" cy="3358515"/>
+                    </a:xfrm>
+                    <a:prstGeom prst="rect"/>
+                  </pic:spPr>
+                </pic:pic>
+              </a:graphicData>
+            </a:graphic>
+          </wp:inline>
+        </w:drawing>
+      </w:r>
+    </w:p>
+    <w:p>
+      <w:pPr>
+        <w:pStyle w:val="ListBullet"/>
+      </w:pPr>
+      <w:r>
+        <w:t>1 Toast locale.</w:t>
+      </w:r>
+    </w:p>
+    <w:p>
+      <w:pPr>
+        <w:pStyle w:val="ListBullet"/>
+      </w:pPr>
+      <w:r>
+        <w:t>2 Notifica persistente con audience.</w:t>
+      </w:r>
+    </w:p>
+    <w:p>
+      <w:pPr>
+        <w:pStyle w:val="ListBullet"/>
+      </w:pPr>
+      <w:r>
+        <w:t>3 Scoping utente/email.</w:t>
+      </w:r>
+    </w:p>
+    <w:p>
+      <w:pPr>
+        <w:pStyle w:val="ListBullet"/>
+      </w:pPr>
+      <w:r>
+        <w:t>4 Lettura automatica.</w:t>
+      </w:r>
+    </w:p>
+    <w:p>
+      <w:pPr>
+        <w:pStyle w:val="ListBullet"/>
+      </w:pPr>
+      <w:r>
+        <w:t>5 Action routing.</w:t>
+      </w:r>
+    </w:p>
+    <w:p>
+      <w:r>
+        <w:rPr>
+          <w:b/>
+          <w:sz w:val="20"/>
+        </w:rPr>
+        <w:t>Figura A28 - Copertura test</w:t>
+      </w:r>
+    </w:p>
+    <w:p>
+      <w:r>
+        <w:drawing>
+          <wp:inline xmlns:a="http://schemas.openxmlformats.org/drawingml/2006/main" xmlns:pic="http://schemas.openxmlformats.org/drawingml/2006/picture">
+            <wp:extent cx="5897880" cy="3358515"/>
+            <wp:docPr id="34" name="Picture 34"/>
+            <wp:cNvGraphicFramePr>
+              <a:graphicFrameLocks noChangeAspect="1"/>
+            </wp:cNvGraphicFramePr>
+            <a:graphic>
+              <a:graphicData uri="http://schemas.openxmlformats.org/drawingml/2006/picture">
+                <pic:pic>
+                  <pic:nvPicPr>
+                    <pic:cNvPr id="0" name="fig-28-test-copertura.png"/>
+                    <pic:cNvPicPr/>
+                  </pic:nvPicPr>
+                  <pic:blipFill>
+                    <a:blip r:embed="rId49"/>
+                    <a:stretch>
+                      <a:fillRect/>
+                    </a:stretch>
+                  </pic:blipFill>
+                  <pic:spPr>
+                    <a:xfrm>
+                      <a:off x="0" y="0"/>
+                      <a:ext cx="5897880" cy="3358515"/>
+                    </a:xfrm>
+                    <a:prstGeom prst="rect"/>
+                  </pic:spPr>
+                </pic:pic>
+              </a:graphicData>
+            </a:graphic>
+          </wp:inline>
+        </w:drawing>
+      </w:r>
+    </w:p>
+    <w:p>
+      <w:pPr>
+        <w:pStyle w:val="ListBullet"/>
+      </w:pPr>
+      <w:r>
+        <w:t>1 Build.</w:t>
+      </w:r>
+    </w:p>
+    <w:p>
+      <w:pPr>
+        <w:pStyle w:val="ListBullet"/>
+      </w:pPr>
+      <w:r>
+        <w:t>2 E2E locale.</w:t>
+      </w:r>
+    </w:p>
+    <w:p>
+      <w:pPr>
+        <w:pStyle w:val="ListBullet"/>
+      </w:pPr>
+      <w:r>
+        <w:t>3 E2E live.</w:t>
+      </w:r>
+    </w:p>
+    <w:p>
+      <w:pPr>
+        <w:pStyle w:val="ListBullet"/>
+      </w:pPr>
+      <w:r>
+        <w:t>4 Regressioni manuali.</w:t>
+      </w:r>
+    </w:p>
+    <w:p>
+      <w:pPr>
+        <w:pStyle w:val="ListBullet"/>
+      </w:pPr>
+      <w:r>
+        <w:t>5 Deep check notifiche.</w:t>
+      </w:r>
+    </w:p>
+    <w:p/>
+    <w:p>
+      <w:pPr>
+        <w:pStyle w:val="Heading1"/>
+      </w:pPr>
+      <w:r>
+        <w:t>15. Checklist di regressione manuale</w:t>
+      </w:r>
+    </w:p>
+    <w:p>
+      <w:pPr>
+        <w:pStyle w:val="ListBullet"/>
+      </w:pPr>
+      <w:r>
+        <w:t>Cliente parte senza interessi o temi preselezionati; “Vedi consigli” resta guidato dallo stato reale.</w:t>
+      </w:r>
+    </w:p>
+    <w:p>
+      <w:pPr>
+        <w:pStyle w:val="ListBullet"/>
+      </w:pPr>
+      <w:r>
+        <w:t>Bottom sheet fisso resta leggibile, non copre modali e disabilita la CTA con hint quando mancano prerequisiti.</w:t>
+      </w:r>
+    </w:p>
+    <w:p>
+      <w:pPr>
+        <w:pStyle w:val="ListBullet"/>
+      </w:pPr>
+      <w:r>
+        <w:t>Date picker usa mese/data corrente del browser; “Adesso” seleziona oggi e non una data hardcoded.</w:t>
+      </w:r>
+    </w:p>
+    <w:p>
+      <w:pPr>
+        <w:pStyle w:val="ListBullet"/>
+      </w:pPr>
+      <w:r>
+        <w:t>Centro notifiche appare solo per FunniFin, Esperto e Brand; Cliente vede solo toast locali.</w:t>
+      </w:r>
+    </w:p>
+    <w:p>
+      <w:pPr>
+        <w:pStyle w:val="ListBullet"/>
+      </w:pPr>
+      <w:r>
+        <w:t>Tab notifiche Da fare/Recenti/Critiche/Chiuse e filtri Tutte/Critiche/Task/Mail/Sistema funzionano su audience visibile.</w:t>
+      </w:r>
+    </w:p>
+    <w:p>
+      <w:pPr>
+        <w:pStyle w:val="ListBullet"/>
+      </w:pPr>
+      <w:r>
+        <w:t>Archivia, Riapri, Svuota archivio e action routing mantengono read state e scoping utente/email.</w:t>
+      </w:r>
+    </w:p>
+    <w:p>
+      <w:pPr>
+        <w:pStyle w:val="ListBullet"/>
+      </w:pPr>
+      <w:r>
+        <w:t>Mail richiesta Cliente ha oggetto corretto, cliente in TO e FunniFin in CC; fallback non deve sembrare consegna certa.</w:t>
+      </w:r>
+    </w:p>
+    <w:p>
+      <w:pPr>
+        <w:pStyle w:val="ListBullet"/>
+      </w:pPr>
+      <w:r>
+        <w:t>Mail workflow usa destinatari della modale e genera notifica task/mail ai ruoli coinvolti.</w:t>
+      </w:r>
+    </w:p>
+    <w:p>
+      <w:pPr>
+        <w:pStyle w:val="ListBullet"/>
+      </w:pPr>
+      <w:r>
+        <w:t>FunniFin può verificare coda, Date, Esperti, Cartella, Conferma, Google backend, Prezzi, Catalogo e Utenti.</w:t>
+      </w:r>
+    </w:p>
+    <w:p>
+      <w:pPr>
+        <w:pStyle w:val="ListBullet"/>
+      </w:pPr>
+      <w:r>
+        <w:t>Esperto può vedere opportunità/incarichi, candidarsi, caricare/selezionare deck e inviare a Brand.</w:t>
+      </w:r>
+    </w:p>
+    <w:p>
+      <w:pPr>
+        <w:pStyle w:val="ListBullet"/>
+      </w:pPr>
+      <w:r>
+        <w:t>Brand può vedere coda, revisionare deck, approvare, chiedere modifiche, caricare nuova versione e abilitare deck Calendar.</w:t>
+      </w:r>
+    </w:p>
     <w:sectPr>
       <w:footerReference w:type="default" r:id="rId9"/>
       <w:headerReference w:type="default" r:id="rId21"/>
@@ -7023,7 +11411,7 @@
       <w:jc w:val="center"/>
     </w:pPr>
     <w:r>
-      <w:t>FunniFin Workshop Planner · Manuale Utente v2.1 · 19 giugno 2026</w:t>
+      <w:t>FunniFin Workshop Planner · Manuale Utente v2.2 · 19 giugno 2026</w:t>
     </w:r>
   </w:p>
 </w:ftr>

</xml_diff>

<commit_message>
Implement guided client journey and workflow fixes
</commit_message>
<xml_diff>
--- a/FunniFin_Manuale_Utente.docx
+++ b/FunniFin_Manuale_Utente.docx
@@ -3580,6 +3580,115 @@
     </w:p>
     <w:p>
       <w:pPr>
+        <w:pStyle w:val="Heading3"/>
+      </w:pPr>
+      <w:r>
+        <w:t>Aggiungere un nuovo workshop a catalogo</w:t>
+      </w:r>
+    </w:p>
+    <w:p>
+      <w:r>
+        <w:t>Oggi il workshop vendibile si aggiunge dal Google Sheet collegato, nel tab CatalogWorkshops. La console FunniFin lo rilegge dalla vista Catalogo Sheet: Canva resta una reference visuale, mentre il dato operativo è lo Sheet.</w:t>
+      </w:r>
+    </w:p>
+    <w:p>
+      <w:pPr>
+        <w:pStyle w:val="Heading3"/>
+      </w:pPr>
+      <w:r>
+        <w:t>Procedura operativa</w:t>
+      </w:r>
+    </w:p>
+    <w:p>
+      <w:pPr>
+        <w:pStyle w:val="ListBullet"/>
+      </w:pPr>
+      <w:r>
+        <w:t>Apri FunniFin &gt; Catalogo &gt; Catalogo Sheet e usa Apri Sheet per raggiungere il file Google collegato.</w:t>
+      </w:r>
+    </w:p>
+    <w:p>
+      <w:pPr>
+        <w:pStyle w:val="ListBullet"/>
+      </w:pPr>
+      <w:r>
+        <w:t>Nel tab CatalogWorkshops aggiungi una nuova riga, oppure duplica un workshop simile e cambia almeno id, titolo, descrizioni e prezzi.</w:t>
+      </w:r>
+    </w:p>
+    <w:p>
+      <w:pPr>
+        <w:pStyle w:val="ListBullet"/>
+      </w:pPr>
+      <w:r>
+        <w:t>Compila i campi obbligatori: id univoco, topicId, themeId, title, short, long, durationOptions, formatOptions, level, target, participants, price1h, price2h, packageAvailable, customAvailable, customExtra, masterSlide, experts, state e active.</w:t>
+      </w:r>
+    </w:p>
+    <w:p>
+      <w:pPr>
+        <w:pStyle w:val="ListBullet"/>
+      </w:pPr>
+      <w:r>
+        <w:t>Verifica che topicId esista nel tab CatalogTopics e che themeId appartenga a quell’ambito; se la relazione non torna, la vista Catalogo segnala una correlazione rotta.</w:t>
+      </w:r>
+    </w:p>
+    <w:p>
+      <w:pPr>
+        <w:pStyle w:val="ListBullet"/>
+      </w:pPr>
+      <w:r>
+        <w:t>Usa valori coerenti con l’app: durationOptions = 1h e/o 2h separati da virgola; formatOptions = live, webinar e/o ibrido; level = base, intermedio o avanzato; state = attivo per pubblicarlo.</w:t>
+      </w:r>
+    </w:p>
+    <w:p>
+      <w:pPr>
+        <w:pStyle w:val="ListBullet"/>
+      </w:pPr>
+      <w:r>
+        <w:t>Imposta active su TRUE per renderlo vendibile. Se devi prepararlo senza mostrarlo al Cliente, usa active = FALSE o state = nascosto.</w:t>
+      </w:r>
+    </w:p>
+    <w:p>
+      <w:pPr>
+        <w:pStyle w:val="ListBullet"/>
+      </w:pPr>
+      <w:r>
+        <w:t>Torna in app e premi Ricarica catalogo Sheet. Il conteggio workshop vendibili deve aumentare e la nuova card deve comparire sotto l’ambito corretto.</w:t>
+      </w:r>
+    </w:p>
+    <w:p>
+      <w:pPr>
+        <w:pStyle w:val="Heading3"/>
+      </w:pPr>
+      <w:r>
+        <w:t>Controlli finali</w:t>
+      </w:r>
+    </w:p>
+    <w:p>
+      <w:pPr>
+        <w:pStyle w:val="ListBullet"/>
+      </w:pPr>
+      <w:r>
+        <w:t>Apri la vista Cliente, seleziona lo stesso ambito/tema e verifica che il workshop appaia nel catalogo filtrabile con prezzo, durata e formato corretti.</w:t>
+      </w:r>
+    </w:p>
+    <w:p>
+      <w:pPr>
+        <w:pStyle w:val="ListBullet"/>
+      </w:pPr>
+      <w:r>
+        <w:t>Se il workshop ha una presentazione operativa, vai in Catalogo &gt; Slide Drive e collega o verifica il file indicato in masterSlide.</w:t>
+      </w:r>
+    </w:p>
+    <w:p>
+      <w:pPr>
+        <w:pStyle w:val="ListBullet"/>
+      </w:pPr>
+      <w:r>
+        <w:t>Se lo Sheet è stato aggiornato ma l’app non cambia, controlla sessione FunniFin, deploy Apps Script e che listCatalogWorkshops risponda dal Google backend.</w:t>
+      </w:r>
+    </w:p>
+    <w:p>
+      <w:pPr>
         <w:pStyle w:val="Heading2"/>
       </w:pPr>
       <w:r>
@@ -11391,6 +11500,20 @@
         <w:t>Brand può vedere coda, revisionare deck, approvare, chiedere modifiche, caricare nuova versione e abilitare deck Calendar.</w:t>
       </w:r>
     </w:p>
+    <w:p/>
+    <w:p/>
+    <w:p/>
+    <w:p/>
+    <w:p/>
+    <w:p/>
+    <w:p/>
+    <w:p/>
+    <w:p/>
+    <w:p/>
+    <w:p/>
+    <w:p/>
+    <w:p/>
+    <w:p/>
     <w:sectPr>
       <w:footerReference w:type="default" r:id="rId9"/>
       <w:headerReference w:type="default" r:id="rId21"/>

</xml_diff>